<commit_message>
feat(lesson-prep): bài tập theo mẫu user (render_baitap)
- render_baitap.py: writing lớn xếp đầu (chỉ đề); mỗi đề Đáp án + Opt1/2/3
  cho câu hoàn thành, 1 đáp án cho 改写/đục lỗ/判断; tô ĐỎ từ/cấu trúc trọng
  tâm trong đáp án (hl). Bỏ qua đọc từ/đặt câu với từ.
- exercise_payload Bài 29 sang schema mới; regenerate baitap.docx.
- SKILL.md: cập nhật ② schema exercise + 生词拓展→exp_extra + ex cá nhân hoá,
  ④ render bằng render_baitap.py.

Co-Authored-By: Claude Opus 4.8 (1M context) <noreply@anthropic.com>
</commit_message>
<xml_diff>
--- a/output/hsk6/buoi29_nucuoi/lesson-prep/baitap.docx
+++ b/output/hsk6/buoi29_nucuoi/lesson-prep/baitap.docx
@@ -3,1696 +3,1595 @@
 <w:document xmlns:wpc="http://schemas.microsoft.com/office/word/2010/wordprocessingCanvas" xmlns:mo="http://schemas.microsoft.com/office/mac/office/2008/main" xmlns:mc="http://schemas.openxmlformats.org/markup-compatibility/2006" xmlns:mv="urn:schemas-microsoft-com:mac:vml" xmlns:o="urn:schemas-microsoft-com:office:office" xmlns:r="http://schemas.openxmlformats.org/officeDocument/2006/relationships" xmlns:m="http://schemas.openxmlformats.org/officeDocument/2006/math" xmlns:v="urn:schemas-microsoft-com:vml" xmlns:wp14="http://schemas.microsoft.com/office/word/2010/wordprocessingDrawing" xmlns:wp="http://schemas.openxmlformats.org/drawingml/2006/wordprocessingDrawing" xmlns:w10="urn:schemas-microsoft-com:office:word" xmlns:w="http://schemas.openxmlformats.org/wordprocessingml/2006/main" xmlns:w14="http://schemas.microsoft.com/office/word/2010/wordml" xmlns:wpg="http://schemas.microsoft.com/office/word/2010/wordprocessingGroup" xmlns:wpi="http://schemas.microsoft.com/office/word/2010/wordprocessingInk" xmlns:wne="http://schemas.microsoft.com/office/word/2006/wordml" xmlns:wps="http://schemas.microsoft.com/office/word/2010/wordprocessingShape" mc:Ignorable="w14 wp14">
   <w:body>
     <w:p>
-      <w:r>
-        <w:rPr>
-          <w:rFonts w:ascii="Calibri" w:hAnsi="Calibri"/>
-          <w:b/>
-          <w:i w:val="0"/>
-          <w:color w:val="6B7683"/>
-          <w:sz w:val="26"/>
-        </w:rPr>
-        <w:t>BÀI TẬP CHUẨN BỊ</w:t>
-      </w:r>
-    </w:p>
-    <w:p>
       <w:pPr>
-        <w:jc w:val="center"/>
+        <w:spacing w:before="0" w:after="160"/>
       </w:pPr>
       <w:r>
         <w:rPr>
-          <w:rFonts w:ascii="Microsoft YaHei" w:hAnsi="Microsoft YaHei" w:eastAsia="Microsoft YaHei"/>
-          <w:b/>
-          <w:i w:val="0"/>
-          <w:color w:val="C0392B"/>
-          <w:sz w:val="40"/>
-        </w:rPr>
-        <w:t>HSK6 · Bài 29 《“笑”的备忘录》</w:t>
-      </w:r>
-    </w:p>
-    <w:p>
-      <w:pPr>
-        <w:spacing w:before="280"/>
-      </w:pPr>
-      <w:r>
-        <w:rPr>
-          <w:rFonts w:ascii="Calibri" w:hAnsi="Calibri"/>
+          <w:rFonts w:ascii="Calibri" w:hAnsi="Calibri" w:eastAsia="Microsoft YaHei"/>
           <w:b/>
           <w:i w:val="0"/>
           <w:color w:val="C0392B"/>
           <w:sz w:val="30"/>
         </w:rPr>
+        <w:t>HSK6 · Bài 29 《“笑”的备忘录》 — Bài tập</w:t>
+      </w:r>
+    </w:p>
+    <w:p>
+      <w:pPr>
+        <w:spacing w:before="40" w:after="40"/>
+      </w:pPr>
+      <w:r>
+        <w:rPr>
+          <w:rFonts w:ascii="Calibri" w:hAnsi="Calibri" w:eastAsia="Microsoft YaHei"/>
+          <w:b/>
+          <w:i w:val="0"/>
+          <w:color w:val="C0392B"/>
+          <w:sz w:val="28"/>
+        </w:rPr>
+        <w:t>Bài viết lớn (作文)</w:t>
+      </w:r>
+    </w:p>
+    <w:p>
+      <w:pPr>
+        <w:spacing w:before="0" w:after="120"/>
+      </w:pPr>
+      <w:r>
+        <w:rPr>
+          <w:rFonts w:ascii="Calibri" w:hAnsi="Calibri" w:eastAsia="Microsoft YaHei"/>
+          <w:b/>
+          <w:i w:val="0"/>
+          <w:color w:val="6B7683"/>
+          <w:sz w:val="24"/>
+        </w:rPr>
+        <w:t xml:space="preserve">Đề: </w:t>
+      </w:r>
+      <w:r>
+        <w:rPr>
+          <w:rFonts w:ascii="Calibri" w:hAnsi="Calibri" w:eastAsia="Microsoft YaHei"/>
+          <w:b w:val="0"/>
+          <w:i w:val="0"/>
+          <w:color w:val="1F2933"/>
+          <w:sz w:val="25"/>
+        </w:rPr>
+        <w:t>本课用两篇小短文给我们讲述了跟“笑”有关的科学知识：人们对假笑很敏感，假笑是怎么被识别出来的？对健康来说，笑有什么益处，有什么坏处，怎么笑才健康？请参考课本练习五，把两篇课文各缩写成200字左右的短文。</w:t>
+      </w:r>
+    </w:p>
+    <w:p>
+      <w:pPr>
+        <w:spacing w:before="240" w:after="40"/>
+      </w:pPr>
+      <w:r>
+        <w:rPr>
+          <w:rFonts w:ascii="Calibri" w:hAnsi="Calibri" w:eastAsia="Microsoft YaHei"/>
+          <w:b/>
+          <w:i w:val="0"/>
+          <w:color w:val="C0392B"/>
+          <w:sz w:val="26"/>
+        </w:rPr>
         <w:t xml:space="preserve">1. </w:t>
       </w:r>
       <w:r>
         <w:rPr>
-          <w:rFonts w:ascii="Microsoft YaHei" w:hAnsi="Microsoft YaHei" w:eastAsia="Microsoft YaHei"/>
+          <w:rFonts w:ascii="Calibri" w:hAnsi="Calibri" w:eastAsia="Microsoft YaHei"/>
           <w:b/>
           <w:i w:val="0"/>
           <w:color w:val="1F2933"/>
-          <w:sz w:val="30"/>
+          <w:sz w:val="26"/>
         </w:rPr>
-        <w:t>语言点 1 — 预先</w:t>
+        <w:t>用“预先”完成句子。</w:t>
       </w:r>
     </w:p>
     <w:p>
+      <w:pPr>
+        <w:spacing w:before="80" w:after="0"/>
+      </w:pPr>
       <w:r>
         <w:rPr>
-          <w:rFonts w:ascii="Calibri" w:hAnsi="Calibri"/>
+          <w:rFonts w:ascii="Calibri" w:hAnsi="Calibri" w:eastAsia="Microsoft YaHei"/>
+          <w:b w:val="0"/>
+          <w:i w:val="0"/>
+          <w:color w:val="1F2933"/>
+          <w:sz w:val="25"/>
+        </w:rPr>
+        <w:t>这事她_________________，我最近都忙糊涂了，忘了告诉你了。</w:t>
+      </w:r>
+    </w:p>
+    <w:p>
+      <w:pPr>
+        <w:spacing w:before="0" w:after="0"/>
+        <w:ind w:left="360"/>
+      </w:pPr>
+      <w:r>
+        <w:rPr>
+          <w:rFonts w:ascii="Calibri" w:hAnsi="Calibri" w:eastAsia="Microsoft YaHei"/>
+          <w:b/>
+          <w:i w:val="0"/>
+          <w:color w:val="C0392B"/>
+          <w:sz w:val="23"/>
+        </w:rPr>
+        <w:t xml:space="preserve">Đáp án: </w:t>
+      </w:r>
+      <w:r>
+        <w:rPr>
+          <w:rFonts w:ascii="Calibri" w:hAnsi="Calibri" w:eastAsia="Microsoft YaHei"/>
+          <w:b/>
+          <w:i w:val="0"/>
+          <w:color w:val="EE0000"/>
+          <w:sz w:val="25"/>
+        </w:rPr>
+        <w:t>预先</w:t>
+      </w:r>
+      <w:r>
+        <w:rPr>
+          <w:rFonts w:ascii="Calibri" w:hAnsi="Calibri" w:eastAsia="Microsoft YaHei"/>
+          <w:b w:val="0"/>
+          <w:i w:val="0"/>
+          <w:color w:val="1F2933"/>
+          <w:sz w:val="25"/>
+        </w:rPr>
+        <w:t>通知我了</w:t>
+      </w:r>
+    </w:p>
+    <w:p>
+      <w:pPr>
+        <w:spacing w:before="0" w:after="0"/>
+        <w:ind w:left="360"/>
+      </w:pPr>
+      <w:r>
+        <w:rPr>
+          <w:rFonts w:ascii="Calibri" w:hAnsi="Calibri" w:eastAsia="Microsoft YaHei"/>
+          <w:b/>
+          <w:i w:val="0"/>
+          <w:color w:val="6B7683"/>
+          <w:sz w:val="22"/>
+        </w:rPr>
+        <w:t xml:space="preserve">Opt1: </w:t>
+      </w:r>
+      <w:r>
+        <w:rPr>
+          <w:rFonts w:ascii="Calibri" w:hAnsi="Calibri" w:eastAsia="Microsoft YaHei"/>
+          <w:b/>
+          <w:i w:val="0"/>
+          <w:color w:val="EE0000"/>
+          <w:sz w:val="25"/>
+        </w:rPr>
+        <w:t>预先</w:t>
+      </w:r>
+      <w:r>
+        <w:rPr>
+          <w:rFonts w:ascii="Calibri" w:hAnsi="Calibri" w:eastAsia="Microsoft YaHei"/>
+          <w:b w:val="0"/>
+          <w:i w:val="0"/>
+          <w:color w:val="1F2933"/>
+          <w:sz w:val="25"/>
+        </w:rPr>
+        <w:t>跟我说过了</w:t>
+      </w:r>
+    </w:p>
+    <w:p>
+      <w:pPr>
+        <w:spacing w:before="0" w:after="0"/>
+        <w:ind w:left="360"/>
+      </w:pPr>
+      <w:r>
+        <w:rPr>
+          <w:rFonts w:ascii="Calibri" w:hAnsi="Calibri" w:eastAsia="Microsoft YaHei"/>
+          <w:b/>
+          <w:i w:val="0"/>
+          <w:color w:val="6B7683"/>
+          <w:sz w:val="22"/>
+        </w:rPr>
+        <w:t xml:space="preserve">Opt2: </w:t>
+      </w:r>
+      <w:r>
+        <w:rPr>
+          <w:rFonts w:ascii="Calibri" w:hAnsi="Calibri" w:eastAsia="Microsoft YaHei"/>
+          <w:b/>
+          <w:i w:val="0"/>
+          <w:color w:val="EE0000"/>
+          <w:sz w:val="25"/>
+        </w:rPr>
+        <w:t>预先</w:t>
+      </w:r>
+      <w:r>
+        <w:rPr>
+          <w:rFonts w:ascii="Calibri" w:hAnsi="Calibri" w:eastAsia="Microsoft YaHei"/>
+          <w:b w:val="0"/>
+          <w:i w:val="0"/>
+          <w:color w:val="1F2933"/>
+          <w:sz w:val="25"/>
+        </w:rPr>
+        <w:t>提醒过我了</w:t>
+      </w:r>
+    </w:p>
+    <w:p>
+      <w:pPr>
+        <w:spacing w:before="0" w:after="0"/>
+        <w:ind w:left="360"/>
+      </w:pPr>
+      <w:r>
+        <w:rPr>
+          <w:rFonts w:ascii="Calibri" w:hAnsi="Calibri" w:eastAsia="Microsoft YaHei"/>
+          <w:b/>
+          <w:i w:val="0"/>
+          <w:color w:val="6B7683"/>
+          <w:sz w:val="22"/>
+        </w:rPr>
+        <w:t xml:space="preserve">Opt3: </w:t>
+      </w:r>
+      <w:r>
+        <w:rPr>
+          <w:rFonts w:ascii="Calibri" w:hAnsi="Calibri" w:eastAsia="Microsoft YaHei"/>
+          <w:b/>
+          <w:i w:val="0"/>
+          <w:color w:val="EE0000"/>
+          <w:sz w:val="25"/>
+        </w:rPr>
+        <w:t>预先</w:t>
+      </w:r>
+      <w:r>
+        <w:rPr>
+          <w:rFonts w:ascii="Calibri" w:hAnsi="Calibri" w:eastAsia="Microsoft YaHei"/>
+          <w:b w:val="0"/>
+          <w:i w:val="0"/>
+          <w:color w:val="1F2933"/>
+          <w:sz w:val="25"/>
+        </w:rPr>
+        <w:t>打过招呼了</w:t>
+      </w:r>
+    </w:p>
+    <w:p>
+      <w:pPr>
+        <w:spacing w:before="80" w:after="0"/>
+      </w:pPr>
+      <w:r>
+        <w:rPr>
+          <w:rFonts w:ascii="Calibri" w:hAnsi="Calibri" w:eastAsia="Microsoft YaHei"/>
+          <w:b w:val="0"/>
+          <w:i w:val="0"/>
+          <w:color w:val="1F2933"/>
+          <w:sz w:val="25"/>
+        </w:rPr>
+        <w:t>他_________________，居然有那么多朋友，在他最困难的时候向他伸出了援手。</w:t>
+      </w:r>
+    </w:p>
+    <w:p>
+      <w:pPr>
+        <w:spacing w:before="0" w:after="0"/>
+        <w:ind w:left="360"/>
+      </w:pPr>
+      <w:r>
+        <w:rPr>
+          <w:rFonts w:ascii="Calibri" w:hAnsi="Calibri" w:eastAsia="Microsoft YaHei"/>
+          <w:b/>
+          <w:i w:val="0"/>
+          <w:color w:val="C0392B"/>
+          <w:sz w:val="23"/>
+        </w:rPr>
+        <w:t xml:space="preserve">Đáp án: </w:t>
+      </w:r>
+      <w:r>
+        <w:rPr>
+          <w:rFonts w:ascii="Calibri" w:hAnsi="Calibri" w:eastAsia="Microsoft YaHei"/>
+          <w:b/>
+          <w:i w:val="0"/>
+          <w:color w:val="EE0000"/>
+          <w:sz w:val="25"/>
+        </w:rPr>
+        <w:t>预先</w:t>
+      </w:r>
+      <w:r>
+        <w:rPr>
+          <w:rFonts w:ascii="Calibri" w:hAnsi="Calibri" w:eastAsia="Microsoft YaHei"/>
+          <w:b w:val="0"/>
+          <w:i w:val="0"/>
+          <w:color w:val="1F2933"/>
+          <w:sz w:val="25"/>
+        </w:rPr>
+        <w:t>没想到的是</w:t>
+      </w:r>
+    </w:p>
+    <w:p>
+      <w:pPr>
+        <w:spacing w:before="0" w:after="0"/>
+        <w:ind w:left="360"/>
+      </w:pPr>
+      <w:r>
+        <w:rPr>
+          <w:rFonts w:ascii="Calibri" w:hAnsi="Calibri" w:eastAsia="Microsoft YaHei"/>
+          <w:b/>
+          <w:i w:val="0"/>
+          <w:color w:val="6B7683"/>
+          <w:sz w:val="22"/>
+        </w:rPr>
+        <w:t xml:space="preserve">Opt1: </w:t>
+      </w:r>
+      <w:r>
+        <w:rPr>
+          <w:rFonts w:ascii="Calibri" w:hAnsi="Calibri" w:eastAsia="Microsoft YaHei"/>
+          <w:b/>
+          <w:i w:val="0"/>
+          <w:color w:val="EE0000"/>
+          <w:sz w:val="25"/>
+        </w:rPr>
+        <w:t>预先</w:t>
+      </w:r>
+      <w:r>
+        <w:rPr>
+          <w:rFonts w:ascii="Calibri" w:hAnsi="Calibri" w:eastAsia="Microsoft YaHei"/>
+          <w:b w:val="0"/>
+          <w:i w:val="0"/>
+          <w:color w:val="1F2933"/>
+          <w:sz w:val="25"/>
+        </w:rPr>
+        <w:t>完全没料到的是</w:t>
+      </w:r>
+    </w:p>
+    <w:p>
+      <w:pPr>
+        <w:spacing w:before="0" w:after="0"/>
+        <w:ind w:left="360"/>
+      </w:pPr>
+      <w:r>
+        <w:rPr>
+          <w:rFonts w:ascii="Calibri" w:hAnsi="Calibri" w:eastAsia="Microsoft YaHei"/>
+          <w:b/>
+          <w:i w:val="0"/>
+          <w:color w:val="6B7683"/>
+          <w:sz w:val="22"/>
+        </w:rPr>
+        <w:t xml:space="preserve">Opt2: </w:t>
+      </w:r>
+      <w:r>
+        <w:rPr>
+          <w:rFonts w:ascii="Calibri" w:hAnsi="Calibri" w:eastAsia="Microsoft YaHei"/>
+          <w:b/>
+          <w:i w:val="0"/>
+          <w:color w:val="EE0000"/>
+          <w:sz w:val="25"/>
+        </w:rPr>
+        <w:t>预先</w:t>
+      </w:r>
+      <w:r>
+        <w:rPr>
+          <w:rFonts w:ascii="Calibri" w:hAnsi="Calibri" w:eastAsia="Microsoft YaHei"/>
+          <w:b w:val="0"/>
+          <w:i w:val="0"/>
+          <w:color w:val="1F2933"/>
+          <w:sz w:val="25"/>
+        </w:rPr>
+        <w:t>怎么也想不到的是</w:t>
+      </w:r>
+    </w:p>
+    <w:p>
+      <w:pPr>
+        <w:spacing w:before="0" w:after="0"/>
+        <w:ind w:left="360"/>
+      </w:pPr>
+      <w:r>
+        <w:rPr>
+          <w:rFonts w:ascii="Calibri" w:hAnsi="Calibri" w:eastAsia="Microsoft YaHei"/>
+          <w:b/>
+          <w:i w:val="0"/>
+          <w:color w:val="6B7683"/>
+          <w:sz w:val="22"/>
+        </w:rPr>
+        <w:t xml:space="preserve">Opt3: </w:t>
+      </w:r>
+      <w:r>
+        <w:rPr>
+          <w:rFonts w:ascii="Calibri" w:hAnsi="Calibri" w:eastAsia="Microsoft YaHei"/>
+          <w:b/>
+          <w:i w:val="0"/>
+          <w:color w:val="EE0000"/>
+          <w:sz w:val="25"/>
+        </w:rPr>
+        <w:t>预先</w:t>
+      </w:r>
+      <w:r>
+        <w:rPr>
+          <w:rFonts w:ascii="Calibri" w:hAnsi="Calibri" w:eastAsia="Microsoft YaHei"/>
+          <w:b w:val="0"/>
+          <w:i w:val="0"/>
+          <w:color w:val="1F2933"/>
+          <w:sz w:val="25"/>
+        </w:rPr>
+        <w:t>根本没想到的是</w:t>
+      </w:r>
+    </w:p>
+    <w:p>
+      <w:pPr>
+        <w:spacing w:before="80" w:after="0"/>
+      </w:pPr>
+      <w:r>
+        <w:rPr>
+          <w:rFonts w:ascii="Calibri" w:hAnsi="Calibri" w:eastAsia="Microsoft YaHei"/>
+          <w:b w:val="0"/>
+          <w:i w:val="0"/>
+          <w:color w:val="1F2933"/>
+          <w:sz w:val="25"/>
+        </w:rPr>
+        <w:t>古代递送紧急公文也骑马……送公文的到了，吃饱喝足，稍稍休息一下，换一匹_________________，继续赶路。</w:t>
+      </w:r>
+    </w:p>
+    <w:p>
+      <w:pPr>
+        <w:spacing w:before="0" w:after="0"/>
+        <w:ind w:left="360"/>
+      </w:pPr>
+      <w:r>
+        <w:rPr>
+          <w:rFonts w:ascii="Calibri" w:hAnsi="Calibri" w:eastAsia="Microsoft YaHei"/>
+          <w:b/>
+          <w:i w:val="0"/>
+          <w:color w:val="C0392B"/>
+          <w:sz w:val="23"/>
+        </w:rPr>
+        <w:t xml:space="preserve">Đáp án: </w:t>
+      </w:r>
+      <w:r>
+        <w:rPr>
+          <w:rFonts w:ascii="Calibri" w:hAnsi="Calibri" w:eastAsia="Microsoft YaHei"/>
+          <w:b/>
+          <w:i w:val="0"/>
+          <w:color w:val="EE0000"/>
+          <w:sz w:val="25"/>
+        </w:rPr>
+        <w:t>预先</w:t>
+      </w:r>
+      <w:r>
+        <w:rPr>
+          <w:rFonts w:ascii="Calibri" w:hAnsi="Calibri" w:eastAsia="Microsoft YaHei"/>
+          <w:b w:val="0"/>
+          <w:i w:val="0"/>
+          <w:color w:val="1F2933"/>
+          <w:sz w:val="25"/>
+        </w:rPr>
+        <w:t>准备好的马</w:t>
+      </w:r>
+    </w:p>
+    <w:p>
+      <w:pPr>
+        <w:spacing w:before="0" w:after="0"/>
+        <w:ind w:left="360"/>
+      </w:pPr>
+      <w:r>
+        <w:rPr>
+          <w:rFonts w:ascii="Calibri" w:hAnsi="Calibri" w:eastAsia="Microsoft YaHei"/>
+          <w:b/>
+          <w:i w:val="0"/>
+          <w:color w:val="6B7683"/>
+          <w:sz w:val="22"/>
+        </w:rPr>
+        <w:t xml:space="preserve">Opt1: </w:t>
+      </w:r>
+      <w:r>
+        <w:rPr>
+          <w:rFonts w:ascii="Calibri" w:hAnsi="Calibri" w:eastAsia="Microsoft YaHei"/>
+          <w:b/>
+          <w:i w:val="0"/>
+          <w:color w:val="EE0000"/>
+          <w:sz w:val="25"/>
+        </w:rPr>
+        <w:t>预先</w:t>
+      </w:r>
+      <w:r>
+        <w:rPr>
+          <w:rFonts w:ascii="Calibri" w:hAnsi="Calibri" w:eastAsia="Microsoft YaHei"/>
+          <w:b w:val="0"/>
+          <w:i w:val="0"/>
+          <w:color w:val="1F2933"/>
+          <w:sz w:val="25"/>
+        </w:rPr>
+        <w:t>备好的马</w:t>
+      </w:r>
+    </w:p>
+    <w:p>
+      <w:pPr>
+        <w:spacing w:before="0" w:after="0"/>
+        <w:ind w:left="360"/>
+      </w:pPr>
+      <w:r>
+        <w:rPr>
+          <w:rFonts w:ascii="Calibri" w:hAnsi="Calibri" w:eastAsia="Microsoft YaHei"/>
+          <w:b/>
+          <w:i w:val="0"/>
+          <w:color w:val="6B7683"/>
+          <w:sz w:val="22"/>
+        </w:rPr>
+        <w:t xml:space="preserve">Opt2: </w:t>
+      </w:r>
+      <w:r>
+        <w:rPr>
+          <w:rFonts w:ascii="Calibri" w:hAnsi="Calibri" w:eastAsia="Microsoft YaHei"/>
+          <w:b/>
+          <w:i w:val="0"/>
+          <w:color w:val="EE0000"/>
+          <w:sz w:val="25"/>
+        </w:rPr>
+        <w:t>预先</w:t>
+      </w:r>
+      <w:r>
+        <w:rPr>
+          <w:rFonts w:ascii="Calibri" w:hAnsi="Calibri" w:eastAsia="Microsoft YaHei"/>
+          <w:b w:val="0"/>
+          <w:i w:val="0"/>
+          <w:color w:val="1F2933"/>
+          <w:sz w:val="25"/>
+        </w:rPr>
+        <w:t>安排好的马</w:t>
+      </w:r>
+    </w:p>
+    <w:p>
+      <w:pPr>
+        <w:spacing w:before="0" w:after="0"/>
+        <w:ind w:left="360"/>
+      </w:pPr>
+      <w:r>
+        <w:rPr>
+          <w:rFonts w:ascii="Calibri" w:hAnsi="Calibri" w:eastAsia="Microsoft YaHei"/>
+          <w:b/>
+          <w:i w:val="0"/>
+          <w:color w:val="6B7683"/>
+          <w:sz w:val="22"/>
+        </w:rPr>
+        <w:t xml:space="preserve">Opt3: </w:t>
+      </w:r>
+      <w:r>
+        <w:rPr>
+          <w:rFonts w:ascii="Calibri" w:hAnsi="Calibri" w:eastAsia="Microsoft YaHei"/>
+          <w:b w:val="0"/>
+          <w:i w:val="0"/>
+          <w:color w:val="1F2933"/>
+          <w:sz w:val="25"/>
+        </w:rPr>
+        <w:t>驿站</w:t>
+      </w:r>
+      <w:r>
+        <w:rPr>
+          <w:rFonts w:ascii="Calibri" w:hAnsi="Calibri" w:eastAsia="Microsoft YaHei"/>
+          <w:b/>
+          <w:i w:val="0"/>
+          <w:color w:val="EE0000"/>
+          <w:sz w:val="25"/>
+        </w:rPr>
+        <w:t>预先</w:t>
+      </w:r>
+      <w:r>
+        <w:rPr>
+          <w:rFonts w:ascii="Calibri" w:hAnsi="Calibri" w:eastAsia="Microsoft YaHei"/>
+          <w:b w:val="0"/>
+          <w:i w:val="0"/>
+          <w:color w:val="1F2933"/>
+          <w:sz w:val="25"/>
+        </w:rPr>
+        <w:t>准备的马</w:t>
+      </w:r>
+    </w:p>
+    <w:p>
+      <w:pPr>
+        <w:spacing w:before="240" w:after="40"/>
+      </w:pPr>
+      <w:r>
+        <w:rPr>
+          <w:rFonts w:ascii="Calibri" w:hAnsi="Calibri" w:eastAsia="Microsoft YaHei"/>
+          <w:b/>
+          <w:i w:val="0"/>
+          <w:color w:val="C0392B"/>
+          <w:sz w:val="26"/>
+        </w:rPr>
+        <w:t xml:space="preserve">2. </w:t>
+      </w:r>
+      <w:r>
+        <w:rPr>
+          <w:rFonts w:ascii="Calibri" w:hAnsi="Calibri" w:eastAsia="Microsoft YaHei"/>
+          <w:b/>
+          <w:i w:val="0"/>
+          <w:color w:val="1F2933"/>
+          <w:sz w:val="26"/>
+        </w:rPr>
+        <w:t>用“……也好/也罢，……也好/也罢”或者“……也好，……也罢”改写句子。</w:t>
+      </w:r>
+    </w:p>
+    <w:p>
+      <w:pPr>
+        <w:spacing w:before="80" w:after="0"/>
+      </w:pPr>
+      <w:r>
+        <w:rPr>
+          <w:rFonts w:ascii="Calibri" w:hAnsi="Calibri" w:eastAsia="Microsoft YaHei"/>
+          <w:b w:val="0"/>
+          <w:i w:val="0"/>
+          <w:color w:val="1F2933"/>
+          <w:sz w:val="25"/>
+        </w:rPr>
+        <w:t>是上学还是工作，只要你自己愿意就行。</w:t>
+      </w:r>
+    </w:p>
+    <w:p>
+      <w:pPr>
+        <w:spacing w:before="0" w:after="0"/>
+        <w:ind w:left="360"/>
+      </w:pPr>
+      <w:r>
+        <w:rPr>
+          <w:rFonts w:ascii="Calibri" w:hAnsi="Calibri" w:eastAsia="Microsoft YaHei"/>
           <w:b/>
           <w:i w:val="0"/>
           <w:color w:val="C0392B"/>
           <w:sz w:val="24"/>
         </w:rPr>
-        <w:t xml:space="preserve">• </w:t>
+        <w:t xml:space="preserve">→ </w:t>
       </w:r>
       <w:r>
         <w:rPr>
-          <w:rFonts w:ascii="Microsoft YaHei" w:hAnsi="Microsoft YaHei" w:eastAsia="Microsoft YaHei"/>
+          <w:rFonts w:ascii="Calibri" w:hAnsi="Calibri" w:eastAsia="Microsoft YaHei"/>
+          <w:b w:val="0"/>
+          <w:i w:val="0"/>
+          <w:color w:val="1F2933"/>
+          <w:sz w:val="25"/>
+        </w:rPr>
+        <w:t>上学</w:t>
+      </w:r>
+      <w:r>
+        <w:rPr>
+          <w:rFonts w:ascii="Calibri" w:hAnsi="Calibri" w:eastAsia="Microsoft YaHei"/>
+          <w:b/>
+          <w:i w:val="0"/>
+          <w:color w:val="EE0000"/>
+          <w:sz w:val="25"/>
+        </w:rPr>
+        <w:t>也好</w:t>
+      </w:r>
+      <w:r>
+        <w:rPr>
+          <w:rFonts w:ascii="Calibri" w:hAnsi="Calibri" w:eastAsia="Microsoft YaHei"/>
+          <w:b w:val="0"/>
+          <w:i w:val="0"/>
+          <w:color w:val="1F2933"/>
+          <w:sz w:val="25"/>
+        </w:rPr>
+        <w:t>，工作</w:t>
+      </w:r>
+      <w:r>
+        <w:rPr>
+          <w:rFonts w:ascii="Calibri" w:hAnsi="Calibri" w:eastAsia="Microsoft YaHei"/>
+          <w:b/>
+          <w:i w:val="0"/>
+          <w:color w:val="EE0000"/>
+          <w:sz w:val="25"/>
+        </w:rPr>
+        <w:t>也罢</w:t>
+      </w:r>
+      <w:r>
+        <w:rPr>
+          <w:rFonts w:ascii="Calibri" w:hAnsi="Calibri" w:eastAsia="Microsoft YaHei"/>
+          <w:b w:val="0"/>
+          <w:i w:val="0"/>
+          <w:color w:val="1F2933"/>
+          <w:sz w:val="25"/>
+        </w:rPr>
+        <w:t>，只要你自己愿意就行。</w:t>
+      </w:r>
+    </w:p>
+    <w:p>
+      <w:pPr>
+        <w:spacing w:before="80" w:after="0"/>
+      </w:pPr>
+      <w:r>
+        <w:rPr>
+          <w:rFonts w:ascii="Calibri" w:hAnsi="Calibri" w:eastAsia="Microsoft YaHei"/>
+          <w:b w:val="0"/>
+          <w:i w:val="0"/>
+          <w:color w:val="1F2933"/>
+          <w:sz w:val="25"/>
+        </w:rPr>
+        <w:t>考试已经完了，考得好不好，再想也没用了。</w:t>
+      </w:r>
+    </w:p>
+    <w:p>
+      <w:pPr>
+        <w:spacing w:before="0" w:after="0"/>
+        <w:ind w:left="360"/>
+      </w:pPr>
+      <w:r>
+        <w:rPr>
+          <w:rFonts w:ascii="Calibri" w:hAnsi="Calibri" w:eastAsia="Microsoft YaHei"/>
+          <w:b/>
+          <w:i w:val="0"/>
+          <w:color w:val="C0392B"/>
+          <w:sz w:val="24"/>
+        </w:rPr>
+        <w:t xml:space="preserve">→ </w:t>
+      </w:r>
+      <w:r>
+        <w:rPr>
+          <w:rFonts w:ascii="Calibri" w:hAnsi="Calibri" w:eastAsia="Microsoft YaHei"/>
+          <w:b w:val="0"/>
+          <w:i w:val="0"/>
+          <w:color w:val="1F2933"/>
+          <w:sz w:val="25"/>
+        </w:rPr>
+        <w:t>考试已经完了，考得好</w:t>
+      </w:r>
+      <w:r>
+        <w:rPr>
+          <w:rFonts w:ascii="Calibri" w:hAnsi="Calibri" w:eastAsia="Microsoft YaHei"/>
+          <w:b/>
+          <w:i w:val="0"/>
+          <w:color w:val="EE0000"/>
+          <w:sz w:val="25"/>
+        </w:rPr>
+        <w:t>也罢</w:t>
+      </w:r>
+      <w:r>
+        <w:rPr>
+          <w:rFonts w:ascii="Calibri" w:hAnsi="Calibri" w:eastAsia="Microsoft YaHei"/>
+          <w:b w:val="0"/>
+          <w:i w:val="0"/>
+          <w:color w:val="1F2933"/>
+          <w:sz w:val="25"/>
+        </w:rPr>
+        <w:t>，不好</w:t>
+      </w:r>
+      <w:r>
+        <w:rPr>
+          <w:rFonts w:ascii="Calibri" w:hAnsi="Calibri" w:eastAsia="Microsoft YaHei"/>
+          <w:b/>
+          <w:i w:val="0"/>
+          <w:color w:val="EE0000"/>
+          <w:sz w:val="25"/>
+        </w:rPr>
+        <w:t>也罢</w:t>
+      </w:r>
+      <w:r>
+        <w:rPr>
+          <w:rFonts w:ascii="Calibri" w:hAnsi="Calibri" w:eastAsia="Microsoft YaHei"/>
+          <w:b w:val="0"/>
+          <w:i w:val="0"/>
+          <w:color w:val="1F2933"/>
+          <w:sz w:val="25"/>
+        </w:rPr>
+        <w:t>，再想也没用了。</w:t>
+      </w:r>
+    </w:p>
+    <w:p>
+      <w:pPr>
+        <w:spacing w:before="80" w:after="0"/>
+      </w:pPr>
+      <w:r>
+        <w:rPr>
+          <w:rFonts w:ascii="Calibri" w:hAnsi="Calibri" w:eastAsia="Microsoft YaHei"/>
+          <w:b w:val="0"/>
+          <w:i w:val="0"/>
+          <w:color w:val="1F2933"/>
+          <w:sz w:val="25"/>
+        </w:rPr>
+        <w:t>不管明天是什么天气，刮风或者下雨，都不能影响我们六点准时出发。</w:t>
+      </w:r>
+    </w:p>
+    <w:p>
+      <w:pPr>
+        <w:spacing w:before="0" w:after="0"/>
+        <w:ind w:left="360"/>
+      </w:pPr>
+      <w:r>
+        <w:rPr>
+          <w:rFonts w:ascii="Calibri" w:hAnsi="Calibri" w:eastAsia="Microsoft YaHei"/>
+          <w:b/>
+          <w:i w:val="0"/>
+          <w:color w:val="C0392B"/>
+          <w:sz w:val="24"/>
+        </w:rPr>
+        <w:t xml:space="preserve">→ </w:t>
+      </w:r>
+      <w:r>
+        <w:rPr>
+          <w:rFonts w:ascii="Calibri" w:hAnsi="Calibri" w:eastAsia="Microsoft YaHei"/>
+          <w:b w:val="0"/>
+          <w:i w:val="0"/>
+          <w:color w:val="1F2933"/>
+          <w:sz w:val="25"/>
+        </w:rPr>
+        <w:t>不管明天是什么天气，刮风</w:t>
+      </w:r>
+      <w:r>
+        <w:rPr>
+          <w:rFonts w:ascii="Calibri" w:hAnsi="Calibri" w:eastAsia="Microsoft YaHei"/>
+          <w:b/>
+          <w:i w:val="0"/>
+          <w:color w:val="EE0000"/>
+          <w:sz w:val="25"/>
+        </w:rPr>
+        <w:t>也好</w:t>
+      </w:r>
+      <w:r>
+        <w:rPr>
+          <w:rFonts w:ascii="Calibri" w:hAnsi="Calibri" w:eastAsia="Microsoft YaHei"/>
+          <w:b w:val="0"/>
+          <w:i w:val="0"/>
+          <w:color w:val="1F2933"/>
+          <w:sz w:val="25"/>
+        </w:rPr>
+        <w:t>，下雨</w:t>
+      </w:r>
+      <w:r>
+        <w:rPr>
+          <w:rFonts w:ascii="Calibri" w:hAnsi="Calibri" w:eastAsia="Microsoft YaHei"/>
+          <w:b/>
+          <w:i w:val="0"/>
+          <w:color w:val="EE0000"/>
+          <w:sz w:val="25"/>
+        </w:rPr>
+        <w:t>也罢</w:t>
+      </w:r>
+      <w:r>
+        <w:rPr>
+          <w:rFonts w:ascii="Calibri" w:hAnsi="Calibri" w:eastAsia="Microsoft YaHei"/>
+          <w:b w:val="0"/>
+          <w:i w:val="0"/>
+          <w:color w:val="1F2933"/>
+          <w:sz w:val="25"/>
+        </w:rPr>
+        <w:t>，都不能影响我们六点准时出发。</w:t>
+      </w:r>
+    </w:p>
+    <w:p>
+      <w:pPr>
+        <w:spacing w:before="240" w:after="40"/>
+      </w:pPr>
+      <w:r>
+        <w:rPr>
+          <w:rFonts w:ascii="Calibri" w:hAnsi="Calibri" w:eastAsia="Microsoft YaHei"/>
+          <w:b/>
+          <w:i w:val="0"/>
+          <w:color w:val="C0392B"/>
+          <w:sz w:val="26"/>
+        </w:rPr>
+        <w:t xml:space="preserve">3. </w:t>
+      </w:r>
+      <w:r>
+        <w:rPr>
+          <w:rFonts w:ascii="Calibri" w:hAnsi="Calibri" w:eastAsia="Microsoft YaHei"/>
           <w:b/>
           <w:i w:val="0"/>
           <w:color w:val="1F2933"/>
           <w:sz w:val="26"/>
         </w:rPr>
-        <w:t>预先 + 动词</w:t>
+        <w:t>判断对错（各 / 诸）</w:t>
       </w:r>
     </w:p>
     <w:p>
       <w:pPr>
+        <w:spacing w:before="0" w:after="40"/>
+      </w:pPr>
+      <w:r>
+        <w:rPr>
+          <w:rFonts w:ascii="Calibri" w:hAnsi="Calibri" w:eastAsia="Microsoft YaHei"/>
+          <w:b w:val="0"/>
+          <w:i/>
+          <w:color w:val="6B7683"/>
+          <w:sz w:val="21"/>
+        </w:rPr>
+        <w:t>Đúng hay sai — nêu lý do; nếu sai thì sửa lại.</w:t>
+      </w:r>
+    </w:p>
+    <w:p>
+      <w:pPr>
+        <w:spacing w:before="80" w:after="0"/>
+      </w:pPr>
+      <w:r>
+        <w:rPr>
+          <w:rFonts w:ascii="Calibri" w:hAnsi="Calibri" w:eastAsia="Microsoft YaHei"/>
+          <w:b w:val="0"/>
+          <w:i w:val="0"/>
+          <w:color w:val="1F2933"/>
+          <w:sz w:val="25"/>
+        </w:rPr>
+        <w:t>亚洲各国首脑都参加了此次会议。</w:t>
+      </w:r>
+    </w:p>
+    <w:p>
+      <w:pPr>
+        <w:spacing w:before="0" w:after="0"/>
         <w:ind w:left="360"/>
       </w:pPr>
       <w:r>
         <w:rPr>
-          <w:rFonts w:ascii="Calibri" w:hAnsi="Calibri"/>
-          <w:b w:val="0"/>
-          <w:i w:val="0"/>
-          <w:color w:val="1F2933"/>
-          <w:sz w:val="24"/>
-        </w:rPr>
-        <w:t>Phó từ, nghĩa là làm sẵn/làm trước một việc gì đó TRƯỚC khi sự việc xảy ra. Đứng trước động từ.</w:t>
-      </w:r>
-    </w:p>
-    <w:p>
-      <w:pPr>
-        <w:ind w:left="360"/>
-      </w:pPr>
-      <w:r>
-        <w:rPr>
-          <w:rFonts w:ascii="Calibri" w:hAnsi="Calibri"/>
-          <w:b/>
-          <w:i w:val="0"/>
-          <w:color w:val="6B7683"/>
-          <w:sz w:val="22"/>
-        </w:rPr>
-        <w:t xml:space="preserve">Vd: </w:t>
-      </w:r>
-      <w:r>
-        <w:rPr>
-          <w:rFonts w:ascii="Microsoft YaHei" w:hAnsi="Microsoft YaHei" w:eastAsia="Microsoft YaHei"/>
-          <w:b w:val="0"/>
-          <w:i w:val="0"/>
-          <w:color w:val="1F2933"/>
-          <w:sz w:val="24"/>
-        </w:rPr>
-        <w:t>到那里去旅行，一定要预先订好旅馆。</w:t>
-      </w:r>
-    </w:p>
-    <w:p>
-      <w:pPr>
-        <w:spacing w:before="280"/>
-      </w:pPr>
-      <w:r>
-        <w:rPr>
-          <w:rFonts w:ascii="Calibri" w:hAnsi="Calibri"/>
-          <w:b/>
-          <w:i w:val="0"/>
-          <w:color w:val="C0392B"/>
-          <w:sz w:val="30"/>
-        </w:rPr>
-        <w:t xml:space="preserve">2. </w:t>
-      </w:r>
-      <w:r>
-        <w:rPr>
-          <w:rFonts w:ascii="Microsoft YaHei" w:hAnsi="Microsoft YaHei" w:eastAsia="Microsoft YaHei"/>
-          <w:b/>
-          <w:i w:val="0"/>
-          <w:color w:val="1F2933"/>
-          <w:sz w:val="30"/>
-        </w:rPr>
-        <w:t>语言点 2 — ……也好，……也罢</w:t>
-      </w:r>
-    </w:p>
-    <w:p>
-      <w:r>
-        <w:rPr>
-          <w:rFonts w:ascii="Calibri" w:hAnsi="Calibri"/>
+          <w:rFonts w:ascii="Calibri" w:hAnsi="Calibri" w:eastAsia="Microsoft YaHei"/>
           <w:b/>
           <w:i w:val="0"/>
           <w:color w:val="C0392B"/>
           <w:sz w:val="24"/>
         </w:rPr>
-        <w:t xml:space="preserve">• </w:t>
+        <w:t xml:space="preserve">→ </w:t>
       </w:r>
       <w:r>
         <w:rPr>
-          <w:rFonts w:ascii="Microsoft YaHei" w:hAnsi="Microsoft YaHei" w:eastAsia="Microsoft YaHei"/>
+          <w:rFonts w:ascii="Calibri" w:hAnsi="Calibri" w:eastAsia="Microsoft YaHei"/>
+          <w:b w:val="0"/>
+          <w:i w:val="0"/>
+          <w:color w:val="1F2933"/>
+          <w:sz w:val="25"/>
+        </w:rPr>
+        <w:t>Đúng. “各国” = mỗi nước, dùng đúng.</w:t>
+      </w:r>
+    </w:p>
+    <w:p>
+      <w:pPr>
+        <w:spacing w:before="80" w:after="0"/>
+      </w:pPr>
+      <w:r>
+        <w:rPr>
+          <w:rFonts w:ascii="Calibri" w:hAnsi="Calibri" w:eastAsia="Microsoft YaHei"/>
+          <w:b w:val="0"/>
+          <w:i w:val="0"/>
+          <w:color w:val="1F2933"/>
+          <w:sz w:val="25"/>
+        </w:rPr>
+        <w:t>经过诸方的共同努力，事情终于圆满解决了。</w:t>
+      </w:r>
+    </w:p>
+    <w:p>
+      <w:pPr>
+        <w:spacing w:before="0" w:after="0"/>
+        <w:ind w:left="360"/>
+      </w:pPr>
+      <w:r>
+        <w:rPr>
+          <w:rFonts w:ascii="Calibri" w:hAnsi="Calibri" w:eastAsia="Microsoft YaHei"/>
+          <w:b/>
+          <w:i w:val="0"/>
+          <w:color w:val="C0392B"/>
+          <w:sz w:val="24"/>
+        </w:rPr>
+        <w:t xml:space="preserve">→ </w:t>
+      </w:r>
+      <w:r>
+        <w:rPr>
+          <w:rFonts w:ascii="Calibri" w:hAnsi="Calibri" w:eastAsia="Microsoft YaHei"/>
+          <w:b w:val="0"/>
+          <w:i w:val="0"/>
+          <w:color w:val="1F2933"/>
+          <w:sz w:val="25"/>
+        </w:rPr>
+        <w:t>Sai → 经过各方的共同努力……（“诸” thường đi với danh từ chỉ người hoặc kết cấu cố định, không nói “诸方”).</w:t>
+      </w:r>
+    </w:p>
+    <w:p>
+      <w:pPr>
+        <w:spacing w:before="80" w:after="0"/>
+      </w:pPr>
+      <w:r>
+        <w:rPr>
+          <w:rFonts w:ascii="Calibri" w:hAnsi="Calibri" w:eastAsia="Microsoft YaHei"/>
+          <w:b w:val="0"/>
+          <w:i w:val="0"/>
+          <w:color w:val="1F2933"/>
+          <w:sz w:val="25"/>
+        </w:rPr>
+        <w:t>三种办法各有优点和缺点，实在难以抉择。</w:t>
+      </w:r>
+    </w:p>
+    <w:p>
+      <w:pPr>
+        <w:spacing w:before="0" w:after="0"/>
+        <w:ind w:left="360"/>
+      </w:pPr>
+      <w:r>
+        <w:rPr>
+          <w:rFonts w:ascii="Calibri" w:hAnsi="Calibri" w:eastAsia="Microsoft YaHei"/>
+          <w:b/>
+          <w:i w:val="0"/>
+          <w:color w:val="C0392B"/>
+          <w:sz w:val="24"/>
+        </w:rPr>
+        <w:t xml:space="preserve">→ </w:t>
+      </w:r>
+      <w:r>
+        <w:rPr>
+          <w:rFonts w:ascii="Calibri" w:hAnsi="Calibri" w:eastAsia="Microsoft YaHei"/>
+          <w:b w:val="0"/>
+          <w:i w:val="0"/>
+          <w:color w:val="1F2933"/>
+          <w:sz w:val="25"/>
+        </w:rPr>
+        <w:t>Đúng. “各有” dùng đúng.</w:t>
+      </w:r>
+    </w:p>
+    <w:p>
+      <w:pPr>
+        <w:spacing w:before="80" w:after="0"/>
+      </w:pPr>
+      <w:r>
+        <w:rPr>
+          <w:rFonts w:ascii="Calibri" w:hAnsi="Calibri" w:eastAsia="Microsoft YaHei"/>
+          <w:b w:val="0"/>
+          <w:i w:val="0"/>
+          <w:color w:val="1F2933"/>
+          <w:sz w:val="25"/>
+        </w:rPr>
+        <w:t>他喜欢读古代诸子百家的著作。</w:t>
+      </w:r>
+    </w:p>
+    <w:p>
+      <w:pPr>
+        <w:spacing w:before="0" w:after="0"/>
+        <w:ind w:left="360"/>
+      </w:pPr>
+      <w:r>
+        <w:rPr>
+          <w:rFonts w:ascii="Calibri" w:hAnsi="Calibri" w:eastAsia="Microsoft YaHei"/>
+          <w:b/>
+          <w:i w:val="0"/>
+          <w:color w:val="C0392B"/>
+          <w:sz w:val="24"/>
+        </w:rPr>
+        <w:t xml:space="preserve">→ </w:t>
+      </w:r>
+      <w:r>
+        <w:rPr>
+          <w:rFonts w:ascii="Calibri" w:hAnsi="Calibri" w:eastAsia="Microsoft YaHei"/>
+          <w:b w:val="0"/>
+          <w:i w:val="0"/>
+          <w:color w:val="1F2933"/>
+          <w:sz w:val="25"/>
+        </w:rPr>
+        <w:t>Đúng. “诸子百家” là kết cấu cố định.</w:t>
+      </w:r>
+    </w:p>
+    <w:p>
+      <w:pPr>
+        <w:spacing w:before="240" w:after="40"/>
+      </w:pPr>
+      <w:r>
+        <w:rPr>
+          <w:rFonts w:ascii="Calibri" w:hAnsi="Calibri" w:eastAsia="Microsoft YaHei"/>
+          <w:b/>
+          <w:i w:val="0"/>
+          <w:color w:val="C0392B"/>
+          <w:sz w:val="26"/>
+        </w:rPr>
+        <w:t xml:space="preserve">4. </w:t>
+      </w:r>
+      <w:r>
+        <w:rPr>
+          <w:rFonts w:ascii="Calibri" w:hAnsi="Calibri" w:eastAsia="Microsoft YaHei"/>
           <w:b/>
           <w:i w:val="0"/>
           <w:color w:val="1F2933"/>
           <w:sz w:val="26"/>
         </w:rPr>
-        <w:t>……也好，……也罢，都/也……</w:t>
+        <w:t>生词拓展 — Đục lỗ (chọn từ điền vào chỗ trống): 损坏 · 循环 · 脂肪 · 收缩 · 动脉</w:t>
       </w:r>
     </w:p>
     <w:p>
       <w:pPr>
+        <w:spacing w:before="80" w:after="0"/>
+      </w:pPr>
+      <w:r>
+        <w:rPr>
+          <w:rFonts w:ascii="Calibri" w:hAnsi="Calibri" w:eastAsia="Microsoft YaHei"/>
+          <w:b w:val="0"/>
+          <w:i w:val="0"/>
+          <w:color w:val="1F2933"/>
+          <w:sz w:val="25"/>
+        </w:rPr>
+        <w:t>新产品面世以前，一般要先调查消费者的购买________，然后经过________的设计，________的生产，过程再找一个________的时机投放到市场，才能获得可观的________。</w:t>
+      </w:r>
+    </w:p>
+    <w:p>
+      <w:pPr>
+        <w:spacing w:before="0" w:after="0"/>
         <w:ind w:left="360"/>
       </w:pPr>
       <w:r>
         <w:rPr>
-          <w:rFonts w:ascii="Calibri" w:hAnsi="Calibri"/>
+          <w:rFonts w:ascii="Calibri" w:hAnsi="Calibri" w:eastAsia="Microsoft YaHei"/>
+          <w:b/>
+          <w:i w:val="0"/>
+          <w:color w:val="C0392B"/>
+          <w:sz w:val="23"/>
+        </w:rPr>
+        <w:t xml:space="preserve">Đáp án: </w:t>
+      </w:r>
+      <w:r>
+        <w:rPr>
+          <w:rFonts w:ascii="Calibri" w:hAnsi="Calibri" w:eastAsia="Microsoft YaHei"/>
           <w:b w:val="0"/>
           <w:i w:val="0"/>
           <w:color w:val="1F2933"/>
-          <w:sz w:val="24"/>
+          <w:sz w:val="25"/>
         </w:rPr>
-        <w:t>Dùng để liệt kê, biểu thị BẤT KỂ trường hợp nào thì kết quả cũng như nhau. Có thể nói “…也好，…也好” hoặc “…也罢，…也罢”; phía sau thường đi với 都/也.</w:t>
+        <w:t>收缩 - 循环 - 动脉 - 损坏 - 脂肪</w:t>
       </w:r>
     </w:p>
     <w:p>
       <w:pPr>
+        <w:spacing w:before="240" w:after="40"/>
+      </w:pPr>
+      <w:r>
+        <w:rPr>
+          <w:rFonts w:ascii="Calibri" w:hAnsi="Calibri" w:eastAsia="Microsoft YaHei"/>
+          <w:b/>
+          <w:i w:val="0"/>
+          <w:color w:val="C0392B"/>
+          <w:sz w:val="26"/>
+        </w:rPr>
+        <w:t xml:space="preserve">5. </w:t>
+      </w:r>
+      <w:r>
+        <w:rPr>
+          <w:rFonts w:ascii="Calibri" w:hAnsi="Calibri" w:eastAsia="Microsoft YaHei"/>
+          <w:b/>
+          <w:i w:val="0"/>
+          <w:color w:val="1F2933"/>
+          <w:sz w:val="26"/>
+        </w:rPr>
+        <w:t>生词拓展 — Đục lỗ (chọn từ điền vào chỗ trống): 恰当 · 周密 · 意向 · 收益 · 一丝不苟</w:t>
+      </w:r>
+    </w:p>
+    <w:p>
+      <w:pPr>
+        <w:spacing w:before="80" w:after="0"/>
+      </w:pPr>
+      <w:r>
+        <w:rPr>
+          <w:rFonts w:ascii="Calibri" w:hAnsi="Calibri" w:eastAsia="Microsoft YaHei"/>
+          <w:b w:val="0"/>
+          <w:i w:val="0"/>
+          <w:color w:val="1F2933"/>
+          <w:sz w:val="25"/>
+        </w:rPr>
+        <w:t>新产品面世以前，一般要先调查消费者的购买________，然后经过________的设计，________的生产，过程再找一个________的时机投放到市场，才能获得可观的________。</w:t>
+      </w:r>
+    </w:p>
+    <w:p>
+      <w:pPr>
+        <w:spacing w:before="0" w:after="0"/>
         <w:ind w:left="360"/>
       </w:pPr>
       <w:r>
         <w:rPr>
-          <w:rFonts w:ascii="Calibri" w:hAnsi="Calibri"/>
+          <w:rFonts w:ascii="Calibri" w:hAnsi="Calibri" w:eastAsia="Microsoft YaHei"/>
           <w:b/>
           <w:i w:val="0"/>
-          <w:color w:val="6B7683"/>
-          <w:sz w:val="22"/>
+          <w:color w:val="C0392B"/>
+          <w:sz w:val="23"/>
         </w:rPr>
-        <w:t xml:space="preserve">Vd: </w:t>
+        <w:t xml:space="preserve">Đáp án: </w:t>
       </w:r>
       <w:r>
         <w:rPr>
-          <w:rFonts w:ascii="Microsoft YaHei" w:hAnsi="Microsoft YaHei" w:eastAsia="Microsoft YaHei"/>
+          <w:rFonts w:ascii="Calibri" w:hAnsi="Calibri" w:eastAsia="Microsoft YaHei"/>
           <w:b w:val="0"/>
           <w:i w:val="0"/>
           <w:color w:val="1F2933"/>
-          <w:sz w:val="24"/>
+          <w:sz w:val="25"/>
         </w:rPr>
-        <w:t>开汽车也罢，骑自行车也罢，行进中打电话都会影响注意力与反应能力。</w:t>
+        <w:t>意向 - 周密 - 一丝不苟 - 恰当 - 收益</w:t>
       </w:r>
     </w:p>
     <w:p>
       <w:pPr>
-        <w:spacing w:before="280"/>
+        <w:spacing w:before="240" w:after="40"/>
       </w:pPr>
       <w:r>
         <w:rPr>
-          <w:rFonts w:ascii="Calibri" w:hAnsi="Calibri"/>
+          <w:rFonts w:ascii="Calibri" w:hAnsi="Calibri" w:eastAsia="Microsoft YaHei"/>
           <w:b/>
           <w:i w:val="0"/>
           <w:color w:val="C0392B"/>
-          <w:sz w:val="30"/>
+          <w:sz w:val="26"/>
         </w:rPr>
-        <w:t xml:space="preserve">3. </w:t>
+        <w:t xml:space="preserve">6. </w:t>
       </w:r>
       <w:r>
         <w:rPr>
-          <w:rFonts w:ascii="Microsoft YaHei" w:hAnsi="Microsoft YaHei" w:eastAsia="Microsoft YaHei"/>
+          <w:rFonts w:ascii="Calibri" w:hAnsi="Calibri" w:eastAsia="Microsoft YaHei"/>
           <w:b/>
           <w:i w:val="0"/>
           <w:color w:val="1F2933"/>
-          <w:sz w:val="30"/>
+          <w:sz w:val="26"/>
         </w:rPr>
-        <w:t>辨析 — 各 / 诸</w:t>
+        <w:t>用所给词语或结构改写句子。</w:t>
       </w:r>
     </w:p>
     <w:p>
+      <w:pPr>
+        <w:spacing w:before="80" w:after="0"/>
+      </w:pPr>
       <w:r>
         <w:rPr>
-          <w:rFonts w:ascii="Calibri" w:hAnsi="Calibri"/>
+          <w:rFonts w:ascii="Calibri" w:hAnsi="Calibri" w:eastAsia="Microsoft YaHei"/>
+          <w:b w:val="0"/>
+          <w:i w:val="0"/>
+          <w:color w:val="1F2933"/>
+          <w:sz w:val="25"/>
+        </w:rPr>
+        <w:t>付出艰苦努力的人什么都没得到，哪有这样的道理啊？（岂有此理）</w:t>
+      </w:r>
+    </w:p>
+    <w:p>
+      <w:pPr>
+        <w:spacing w:before="0" w:after="0"/>
+        <w:ind w:left="360"/>
+      </w:pPr>
+      <w:r>
+        <w:rPr>
+          <w:rFonts w:ascii="Calibri" w:hAnsi="Calibri" w:eastAsia="Microsoft YaHei"/>
           <w:b/>
           <w:i w:val="0"/>
           <w:color w:val="C0392B"/>
           <w:sz w:val="24"/>
         </w:rPr>
-        <w:t xml:space="preserve">• </w:t>
+        <w:t xml:space="preserve">→ </w:t>
       </w:r>
       <w:r>
         <w:rPr>
-          <w:rFonts w:ascii="Microsoft YaHei" w:hAnsi="Microsoft YaHei" w:eastAsia="Microsoft YaHei"/>
+          <w:rFonts w:ascii="Calibri" w:hAnsi="Calibri" w:eastAsia="Microsoft YaHei"/>
+          <w:b w:val="0"/>
+          <w:i w:val="0"/>
+          <w:color w:val="1F2933"/>
+          <w:sz w:val="25"/>
+        </w:rPr>
+        <w:t>付出艰苦努力的人什么都没得到，真是</w:t>
+      </w:r>
+      <w:r>
+        <w:rPr>
+          <w:rFonts w:ascii="Calibri" w:hAnsi="Calibri" w:eastAsia="Microsoft YaHei"/>
           <w:b/>
           <w:i w:val="0"/>
+          <w:color w:val="EE0000"/>
+          <w:sz w:val="25"/>
+        </w:rPr>
+        <w:t>岂有此理</w:t>
+      </w:r>
+      <w:r>
+        <w:rPr>
+          <w:rFonts w:ascii="Calibri" w:hAnsi="Calibri" w:eastAsia="Microsoft YaHei"/>
+          <w:b w:val="0"/>
+          <w:i w:val="0"/>
           <w:color w:val="1F2933"/>
-          <w:sz w:val="26"/>
+          <w:sz w:val="25"/>
         </w:rPr>
-        <w:t>各 (mỗi, các)</w:t>
+        <w:t>。</w:t>
       </w:r>
     </w:p>
     <w:p>
       <w:pPr>
+        <w:spacing w:before="80" w:after="0"/>
+      </w:pPr>
+      <w:r>
+        <w:rPr>
+          <w:rFonts w:ascii="Calibri" w:hAnsi="Calibri" w:eastAsia="Microsoft YaHei"/>
+          <w:b w:val="0"/>
+          <w:i w:val="0"/>
+          <w:color w:val="1F2933"/>
+          <w:sz w:val="25"/>
+        </w:rPr>
+        <w:t>我已经提前做好了计划，所以实施起来很顺利。（预先）</w:t>
+      </w:r>
+    </w:p>
+    <w:p>
+      <w:pPr>
+        <w:spacing w:before="0" w:after="0"/>
         <w:ind w:left="360"/>
       </w:pPr>
       <w:r>
         <w:rPr>
-          <w:rFonts w:ascii="Calibri" w:hAnsi="Calibri"/>
-          <w:b w:val="0"/>
-          <w:i w:val="0"/>
-          <w:color w:val="1F2933"/>
-          <w:sz w:val="24"/>
-        </w:rPr>
-        <w:t>Chỉ mọi cá thể trong một phạm vi (người hoặc vật); có thể làm phó từ đứng trước động từ với nghĩa “mỗi/riêng”.</w:t>
-      </w:r>
-    </w:p>
-    <w:p>
-      <w:pPr>
-        <w:ind w:left="360"/>
-      </w:pPr>
-      <w:r>
-        <w:rPr>
-          <w:rFonts w:ascii="Calibri" w:hAnsi="Calibri"/>
-          <w:b/>
-          <w:i w:val="0"/>
-          <w:color w:val="6B7683"/>
-          <w:sz w:val="22"/>
-        </w:rPr>
-        <w:t xml:space="preserve">Vd: </w:t>
-      </w:r>
-      <w:r>
-        <w:rPr>
-          <w:rFonts w:ascii="Microsoft YaHei" w:hAnsi="Microsoft YaHei" w:eastAsia="Microsoft YaHei"/>
-          <w:b w:val="0"/>
-          <w:i w:val="0"/>
-          <w:color w:val="1F2933"/>
-          <w:sz w:val="24"/>
-        </w:rPr>
-        <w:t>双方各执一词。/ 几种水果他各买了一斤。</w:t>
-      </w:r>
-    </w:p>
-    <w:p>
-      <w:r>
-        <w:rPr>
-          <w:rFonts w:ascii="Calibri" w:hAnsi="Calibri"/>
+          <w:rFonts w:ascii="Calibri" w:hAnsi="Calibri" w:eastAsia="Microsoft YaHei"/>
           <w:b/>
           <w:i w:val="0"/>
           <w:color w:val="C0392B"/>
           <w:sz w:val="24"/>
         </w:rPr>
-        <w:t xml:space="preserve">• </w:t>
+        <w:t xml:space="preserve">→ </w:t>
       </w:r>
       <w:r>
         <w:rPr>
-          <w:rFonts w:ascii="Microsoft YaHei" w:hAnsi="Microsoft YaHei" w:eastAsia="Microsoft YaHei"/>
+          <w:rFonts w:ascii="Calibri" w:hAnsi="Calibri" w:eastAsia="Microsoft YaHei"/>
+          <w:b w:val="0"/>
+          <w:i w:val="0"/>
+          <w:color w:val="1F2933"/>
+          <w:sz w:val="25"/>
+        </w:rPr>
+        <w:t>我已经</w:t>
+      </w:r>
+      <w:r>
+        <w:rPr>
+          <w:rFonts w:ascii="Calibri" w:hAnsi="Calibri" w:eastAsia="Microsoft YaHei"/>
           <w:b/>
           <w:i w:val="0"/>
+          <w:color w:val="EE0000"/>
+          <w:sz w:val="25"/>
+        </w:rPr>
+        <w:t>预先</w:t>
+      </w:r>
+      <w:r>
+        <w:rPr>
+          <w:rFonts w:ascii="Calibri" w:hAnsi="Calibri" w:eastAsia="Microsoft YaHei"/>
+          <w:b w:val="0"/>
+          <w:i w:val="0"/>
           <w:color w:val="1F2933"/>
-          <w:sz w:val="26"/>
+          <w:sz w:val="25"/>
         </w:rPr>
-        <w:t>诸 (chư, chúng, nhiều)</w:t>
+        <w:t>做好了计划，所以实施起来很顺利。</w:t>
       </w:r>
     </w:p>
     <w:p>
       <w:pPr>
+        <w:spacing w:before="80" w:after="0"/>
+      </w:pPr>
+      <w:r>
+        <w:rPr>
+          <w:rFonts w:ascii="Calibri" w:hAnsi="Calibri" w:eastAsia="Microsoft YaHei"/>
+          <w:b w:val="0"/>
+          <w:i w:val="0"/>
+          <w:color w:val="1F2933"/>
+          <w:sz w:val="25"/>
+        </w:rPr>
+        <w:t>无论富贵还是贫穷，我对他的爱不会改变。（……也好，……也罢）</w:t>
+      </w:r>
+    </w:p>
+    <w:p>
+      <w:pPr>
+        <w:spacing w:before="0" w:after="0"/>
         <w:ind w:left="360"/>
       </w:pPr>
       <w:r>
         <w:rPr>
-          <w:rFonts w:ascii="Calibri" w:hAnsi="Calibri"/>
-          <w:b w:val="0"/>
-          <w:i w:val="0"/>
-          <w:color w:val="1F2933"/>
-          <w:sz w:val="24"/>
-        </w:rPr>
-        <w:t>Văn viết, nghĩa “nhiều, các”; danh từ theo sau thường chỉ người, phần lớn là kết cấu cố định (诸位/诸君/诸子百家). Trong 诸位/各位 thì hai từ dùng như nhau.</w:t>
-      </w:r>
-    </w:p>
-    <w:p>
-      <w:pPr>
-        <w:ind w:left="360"/>
-      </w:pPr>
-      <w:r>
-        <w:rPr>
-          <w:rFonts w:ascii="Calibri" w:hAnsi="Calibri"/>
-          <w:b/>
-          <w:i w:val="0"/>
-          <w:color w:val="6B7683"/>
-          <w:sz w:val="22"/>
-        </w:rPr>
-        <w:t xml:space="preserve">Vd: </w:t>
-      </w:r>
-      <w:r>
-        <w:rPr>
-          <w:rFonts w:ascii="Microsoft YaHei" w:hAnsi="Microsoft YaHei" w:eastAsia="Microsoft YaHei"/>
-          <w:b w:val="0"/>
-          <w:i w:val="0"/>
-          <w:color w:val="1F2933"/>
-          <w:sz w:val="24"/>
-        </w:rPr>
-        <w:t>诸位/各位有何意见，请尽量发表。</w:t>
-      </w:r>
-    </w:p>
-    <w:p>
-      <w:pPr>
-        <w:spacing w:before="280"/>
-      </w:pPr>
-      <w:r>
-        <w:rPr>
-          <w:rFonts w:ascii="Calibri" w:hAnsi="Calibri"/>
-          <w:b/>
-          <w:i w:val="0"/>
-          <w:color w:val="C0392B"/>
-          <w:sz w:val="30"/>
-        </w:rPr>
-        <w:t xml:space="preserve">4. </w:t>
-      </w:r>
-      <w:r>
-        <w:rPr>
-          <w:rFonts w:ascii="Microsoft YaHei" w:hAnsi="Microsoft YaHei" w:eastAsia="Microsoft YaHei"/>
-          <w:b/>
-          <w:i w:val="0"/>
-          <w:color w:val="1F2933"/>
-          <w:sz w:val="30"/>
-        </w:rPr>
-        <w:t>修辞（六）— 设问</w:t>
-      </w:r>
-    </w:p>
-    <w:p>
-      <w:r>
-        <w:rPr>
-          <w:rFonts w:ascii="Calibri" w:hAnsi="Calibri"/>
+          <w:rFonts w:ascii="Calibri" w:hAnsi="Calibri" w:eastAsia="Microsoft YaHei"/>
           <w:b/>
           <w:i w:val="0"/>
           <w:color w:val="C0392B"/>
           <w:sz w:val="24"/>
         </w:rPr>
-        <w:t xml:space="preserve">• </w:t>
+        <w:t xml:space="preserve">→ </w:t>
       </w:r>
       <w:r>
         <w:rPr>
-          <w:rFonts w:ascii="Microsoft YaHei" w:hAnsi="Microsoft YaHei" w:eastAsia="Microsoft YaHei"/>
+          <w:rFonts w:ascii="Calibri" w:hAnsi="Calibri" w:eastAsia="Microsoft YaHei"/>
+          <w:b w:val="0"/>
+          <w:i w:val="0"/>
+          <w:color w:val="1F2933"/>
+          <w:sz w:val="25"/>
+        </w:rPr>
+        <w:t>富贵</w:t>
+      </w:r>
+      <w:r>
+        <w:rPr>
+          <w:rFonts w:ascii="Calibri" w:hAnsi="Calibri" w:eastAsia="Microsoft YaHei"/>
           <w:b/>
           <w:i w:val="0"/>
+          <w:color w:val="EE0000"/>
+          <w:sz w:val="25"/>
+        </w:rPr>
+        <w:t>也好</w:t>
+      </w:r>
+      <w:r>
+        <w:rPr>
+          <w:rFonts w:ascii="Calibri" w:hAnsi="Calibri" w:eastAsia="Microsoft YaHei"/>
+          <w:b w:val="0"/>
+          <w:i w:val="0"/>
           <w:color w:val="1F2933"/>
-          <w:sz w:val="26"/>
+          <w:sz w:val="25"/>
         </w:rPr>
-        <w:t>无疑而问，自问自答（设问）</w:t>
+        <w:t>，贫穷</w:t>
+      </w:r>
+      <w:r>
+        <w:rPr>
+          <w:rFonts w:ascii="Calibri" w:hAnsi="Calibri" w:eastAsia="Microsoft YaHei"/>
+          <w:b/>
+          <w:i w:val="0"/>
+          <w:color w:val="EE0000"/>
+          <w:sz w:val="25"/>
+        </w:rPr>
+        <w:t>也罢</w:t>
+      </w:r>
+      <w:r>
+        <w:rPr>
+          <w:rFonts w:ascii="Calibri" w:hAnsi="Calibri" w:eastAsia="Microsoft YaHei"/>
+          <w:b w:val="0"/>
+          <w:i w:val="0"/>
+          <w:color w:val="1F2933"/>
+          <w:sz w:val="25"/>
+        </w:rPr>
+        <w:t>，我对他的爱不会改变。</w:t>
       </w:r>
     </w:p>
     <w:p>
       <w:pPr>
+        <w:spacing w:before="80" w:after="0"/>
+      </w:pPr>
+      <w:r>
+        <w:rPr>
+          <w:rFonts w:ascii="Calibri" w:hAnsi="Calibri" w:eastAsia="Microsoft YaHei"/>
+          <w:b w:val="0"/>
+          <w:i w:val="0"/>
+          <w:color w:val="1F2933"/>
+          <w:sz w:val="25"/>
+        </w:rPr>
+        <w:t>“米”是国际上普遍使用的基本长度单位。（通用）</w:t>
+      </w:r>
+    </w:p>
+    <w:p>
+      <w:pPr>
+        <w:spacing w:before="0" w:after="0"/>
         <w:ind w:left="360"/>
       </w:pPr>
       <w:r>
         <w:rPr>
-          <w:rFonts w:ascii="Calibri" w:hAnsi="Calibri"/>
-          <w:b w:val="0"/>
-          <w:i w:val="0"/>
-          <w:color w:val="1F2933"/>
-          <w:sz w:val="24"/>
-        </w:rPr>
-        <w:t>Tự đặt câu hỏi rồi tự trả lời. Tác dụng: (1) gây chú ý, gợi cho người đọc suy nghĩ; (2) tiện tổ chức bài, giúp chuyển ý tự nhiên, gọn.</w:t>
-      </w:r>
-    </w:p>
-    <w:p>
-      <w:pPr>
-        <w:ind w:left="360"/>
-      </w:pPr>
-      <w:r>
-        <w:rPr>
-          <w:rFonts w:ascii="Calibri" w:hAnsi="Calibri"/>
-          <w:b/>
-          <w:i w:val="0"/>
-          <w:color w:val="6B7683"/>
-          <w:sz w:val="22"/>
-        </w:rPr>
-        <w:t xml:space="preserve">Vd: </w:t>
-      </w:r>
-      <w:r>
-        <w:rPr>
-          <w:rFonts w:ascii="Microsoft YaHei" w:hAnsi="Microsoft YaHei" w:eastAsia="Microsoft YaHei"/>
-          <w:b w:val="0"/>
-          <w:i w:val="0"/>
-          <w:color w:val="1F2933"/>
-          <w:sz w:val="24"/>
-        </w:rPr>
-        <w:t>难道我们听到庸俗、不上档次的笑话假笑两声，敷衍一下也不可以吗？可是，好像确实不行。</w:t>
-      </w:r>
-    </w:p>
-    <w:p>
-      <w:pPr>
-        <w:spacing w:before="280"/>
-      </w:pPr>
-      <w:r>
-        <w:rPr>
-          <w:rFonts w:ascii="Calibri" w:hAnsi="Calibri"/>
-          <w:b/>
-          <w:i w:val="0"/>
-          <w:color w:val="C0392B"/>
-          <w:sz w:val="30"/>
-        </w:rPr>
-        <w:t xml:space="preserve">5. </w:t>
-      </w:r>
-      <w:r>
-        <w:rPr>
-          <w:rFonts w:ascii="Microsoft YaHei" w:hAnsi="Microsoft YaHei" w:eastAsia="Microsoft YaHei"/>
-          <w:b/>
-          <w:i w:val="0"/>
-          <w:color w:val="1F2933"/>
-          <w:sz w:val="30"/>
-        </w:rPr>
-        <w:t>用“预先”完成句子</w:t>
-      </w:r>
-    </w:p>
-    <w:p>
-      <w:r>
-        <w:rPr>
-          <w:rFonts w:ascii="Calibri" w:hAnsi="Calibri"/>
+          <w:rFonts w:ascii="Calibri" w:hAnsi="Calibri" w:eastAsia="Microsoft YaHei"/>
           <w:b/>
           <w:i w:val="0"/>
           <w:color w:val="C0392B"/>
           <w:sz w:val="24"/>
         </w:rPr>
-        <w:t xml:space="preserve">1) </w:t>
+        <w:t xml:space="preserve">→ </w:t>
       </w:r>
       <w:r>
         <w:rPr>
-          <w:rFonts w:ascii="Calibri" w:hAnsi="Calibri"/>
-          <w:b/>
+          <w:rFonts w:ascii="Calibri" w:hAnsi="Calibri" w:eastAsia="Microsoft YaHei"/>
+          <w:b w:val="0"/>
           <w:i w:val="0"/>
-          <w:color w:val="6B7683"/>
-          <w:sz w:val="22"/>
+          <w:color w:val="1F2933"/>
+          <w:sz w:val="25"/>
         </w:rPr>
-        <w:t xml:space="preserve">Chuẩn (đủ điểm): </w:t>
+        <w:t>“米”是国际上</w:t>
       </w:r>
       <w:r>
         <w:rPr>
-          <w:rFonts w:ascii="Microsoft YaHei" w:hAnsi="Microsoft YaHei" w:eastAsia="Microsoft YaHei"/>
+          <w:rFonts w:ascii="Calibri" w:hAnsi="Calibri" w:eastAsia="Microsoft YaHei"/>
+          <w:b/>
+          <w:i w:val="0"/>
+          <w:color w:val="EE0000"/>
+          <w:sz w:val="25"/>
+        </w:rPr>
+        <w:t>通用</w:t>
+      </w:r>
+      <w:r>
+        <w:rPr>
+          <w:rFonts w:ascii="Calibri" w:hAnsi="Calibri" w:eastAsia="Microsoft YaHei"/>
           <w:b w:val="0"/>
           <w:i w:val="0"/>
           <w:color w:val="1F2933"/>
-          <w:sz w:val="28"/>
+          <w:sz w:val="25"/>
         </w:rPr>
-        <w:t>预先通知我了</w:t>
-      </w:r>
-      <w:r>
-        <w:rPr>
-          <w:rFonts w:ascii="Calibri" w:hAnsi="Calibri"/>
-          <w:b w:val="0"/>
-          <w:i/>
-          <w:color w:val="6B7683"/>
-          <w:sz w:val="20"/>
-        </w:rPr>
-        <w:t xml:space="preserve">  [slide]</w:t>
+        <w:t>的基本长度单位。</w:t>
       </w:r>
     </w:p>
     <w:p>
+      <w:pPr>
+        <w:spacing w:before="80" w:after="0"/>
+      </w:pPr>
       <w:r>
         <w:rPr>
-          <w:rFonts w:ascii="Calibri" w:hAnsi="Calibri"/>
+          <w:rFonts w:ascii="Calibri" w:hAnsi="Calibri" w:eastAsia="Microsoft YaHei"/>
+          <w:b w:val="0"/>
+          <w:i w:val="0"/>
+          <w:color w:val="1F2933"/>
+          <w:sz w:val="25"/>
+        </w:rPr>
+        <w:t>问题的本质在于某些人缺乏责任心。（实质）</w:t>
+      </w:r>
+    </w:p>
+    <w:p>
+      <w:pPr>
+        <w:spacing w:before="0" w:after="0"/>
+        <w:ind w:left="360"/>
+      </w:pPr>
+      <w:r>
+        <w:rPr>
+          <w:rFonts w:ascii="Calibri" w:hAnsi="Calibri" w:eastAsia="Microsoft YaHei"/>
           <w:b/>
           <w:i w:val="0"/>
           <w:color w:val="C0392B"/>
           <w:sz w:val="24"/>
         </w:rPr>
-        <w:t xml:space="preserve">2) </w:t>
+        <w:t xml:space="preserve">→ </w:t>
       </w:r>
       <w:r>
         <w:rPr>
-          <w:rFonts w:ascii="Calibri" w:hAnsi="Calibri"/>
-          <w:b/>
+          <w:rFonts w:ascii="Calibri" w:hAnsi="Calibri" w:eastAsia="Microsoft YaHei"/>
+          <w:b w:val="0"/>
           <w:i w:val="0"/>
-          <w:color w:val="6B7683"/>
-          <w:sz w:val="22"/>
+          <w:color w:val="1F2933"/>
+          <w:sz w:val="25"/>
         </w:rPr>
-        <w:t xml:space="preserve">Chuẩn (đủ điểm): </w:t>
+        <w:t>问题的</w:t>
       </w:r>
       <w:r>
         <w:rPr>
-          <w:rFonts w:ascii="Microsoft YaHei" w:hAnsi="Microsoft YaHei" w:eastAsia="Microsoft YaHei"/>
+          <w:rFonts w:ascii="Calibri" w:hAnsi="Calibri" w:eastAsia="Microsoft YaHei"/>
+          <w:b/>
+          <w:i w:val="0"/>
+          <w:color w:val="EE0000"/>
+          <w:sz w:val="25"/>
+        </w:rPr>
+        <w:t>实质</w:t>
+      </w:r>
+      <w:r>
+        <w:rPr>
+          <w:rFonts w:ascii="Calibri" w:hAnsi="Calibri" w:eastAsia="Microsoft YaHei"/>
           <w:b w:val="0"/>
           <w:i w:val="0"/>
           <w:color w:val="1F2933"/>
-          <w:sz w:val="28"/>
+          <w:sz w:val="25"/>
         </w:rPr>
-        <w:t>预先没想到的是</w:t>
-      </w:r>
-      <w:r>
-        <w:rPr>
-          <w:rFonts w:ascii="Calibri" w:hAnsi="Calibri"/>
-          <w:b w:val="0"/>
-          <w:i/>
-          <w:color w:val="6B7683"/>
-          <w:sz w:val="20"/>
-        </w:rPr>
-        <w:t xml:space="preserve">  [slide]</w:t>
+        <w:t>在于某些人缺乏责任心。</w:t>
       </w:r>
     </w:p>
     <w:p>
+      <w:pPr>
+        <w:spacing w:before="80" w:after="0"/>
+      </w:pPr>
       <w:r>
         <w:rPr>
-          <w:rFonts w:ascii="Calibri" w:hAnsi="Calibri"/>
+          <w:rFonts w:ascii="Calibri" w:hAnsi="Calibri" w:eastAsia="Microsoft YaHei"/>
+          <w:b w:val="0"/>
+          <w:i w:val="0"/>
+          <w:color w:val="1F2933"/>
+          <w:sz w:val="25"/>
+        </w:rPr>
+        <w:t>明天的会议很重要，发言稿你好好考虑考虑。（斟酌）</w:t>
+      </w:r>
+    </w:p>
+    <w:p>
+      <w:pPr>
+        <w:spacing w:before="0" w:after="0"/>
+        <w:ind w:left="360"/>
+      </w:pPr>
+      <w:r>
+        <w:rPr>
+          <w:rFonts w:ascii="Calibri" w:hAnsi="Calibri" w:eastAsia="Microsoft YaHei"/>
           <w:b/>
           <w:i w:val="0"/>
           <w:color w:val="C0392B"/>
           <w:sz w:val="24"/>
         </w:rPr>
-        <w:t xml:space="preserve">3) </w:t>
+        <w:t xml:space="preserve">→ </w:t>
       </w:r>
       <w:r>
         <w:rPr>
-          <w:rFonts w:ascii="Calibri" w:hAnsi="Calibri"/>
-          <w:b/>
+          <w:rFonts w:ascii="Calibri" w:hAnsi="Calibri" w:eastAsia="Microsoft YaHei"/>
+          <w:b w:val="0"/>
           <w:i w:val="0"/>
-          <w:color w:val="6B7683"/>
-          <w:sz w:val="22"/>
+          <w:color w:val="1F2933"/>
+          <w:sz w:val="25"/>
         </w:rPr>
-        <w:t xml:space="preserve">Chuẩn (đủ điểm): </w:t>
+        <w:t>明天的会议很重要，发言稿你好好儿</w:t>
       </w:r>
       <w:r>
         <w:rPr>
-          <w:rFonts w:ascii="Microsoft YaHei" w:hAnsi="Microsoft YaHei" w:eastAsia="Microsoft YaHei"/>
+          <w:rFonts w:ascii="Calibri" w:hAnsi="Calibri" w:eastAsia="Microsoft YaHei"/>
+          <w:b/>
+          <w:i w:val="0"/>
+          <w:color w:val="EE0000"/>
+          <w:sz w:val="25"/>
+        </w:rPr>
+        <w:t>斟酌</w:t>
+      </w:r>
+      <w:r>
+        <w:rPr>
+          <w:rFonts w:ascii="Calibri" w:hAnsi="Calibri" w:eastAsia="Microsoft YaHei"/>
+          <w:b/>
+          <w:i w:val="0"/>
+          <w:color w:val="EE0000"/>
+          <w:sz w:val="25"/>
+        </w:rPr>
+        <w:t>斟酌</w:t>
+      </w:r>
+      <w:r>
+        <w:rPr>
+          <w:rFonts w:ascii="Calibri" w:hAnsi="Calibri" w:eastAsia="Microsoft YaHei"/>
           <w:b w:val="0"/>
           <w:i w:val="0"/>
           <w:color w:val="1F2933"/>
-          <w:sz w:val="28"/>
+          <w:sz w:val="25"/>
         </w:rPr>
-        <w:t>预先准备好的马</w:t>
-      </w:r>
-      <w:r>
-        <w:rPr>
-          <w:rFonts w:ascii="Calibri" w:hAnsi="Calibri"/>
-          <w:b w:val="0"/>
-          <w:i/>
-          <w:color w:val="6B7683"/>
-          <w:sz w:val="20"/>
-        </w:rPr>
-        <w:t xml:space="preserve">  [slide]</w:t>
-      </w:r>
-    </w:p>
-    <w:p>
-      <w:pPr>
-        <w:spacing w:before="280"/>
-      </w:pPr>
-      <w:r>
-        <w:rPr>
-          <w:rFonts w:ascii="Calibri" w:hAnsi="Calibri"/>
-          <w:b/>
-          <w:i w:val="0"/>
-          <w:color w:val="C0392B"/>
-          <w:sz w:val="30"/>
-        </w:rPr>
-        <w:t xml:space="preserve">6. </w:t>
-      </w:r>
-      <w:r>
-        <w:rPr>
-          <w:rFonts w:ascii="Microsoft YaHei" w:hAnsi="Microsoft YaHei" w:eastAsia="Microsoft YaHei"/>
-          <w:b/>
-          <w:i w:val="0"/>
-          <w:color w:val="1F2933"/>
-          <w:sz w:val="30"/>
-        </w:rPr>
-        <w:t>用所给词语或结构改写句子</w:t>
-      </w:r>
-    </w:p>
-    <w:p>
-      <w:r>
-        <w:rPr>
-          <w:rFonts w:ascii="Calibri" w:hAnsi="Calibri"/>
-          <w:b/>
-          <w:i w:val="0"/>
-          <w:color w:val="C0392B"/>
-          <w:sz w:val="24"/>
-        </w:rPr>
-        <w:t xml:space="preserve">1) </w:t>
-      </w:r>
-      <w:r>
-        <w:rPr>
-          <w:rFonts w:ascii="Calibri" w:hAnsi="Calibri"/>
-          <w:b/>
-          <w:i w:val="0"/>
-          <w:color w:val="6B7683"/>
-          <w:sz w:val="22"/>
-        </w:rPr>
-        <w:t xml:space="preserve">Chuẩn (đủ điểm): </w:t>
-      </w:r>
-      <w:r>
-        <w:rPr>
-          <w:rFonts w:ascii="Microsoft YaHei" w:hAnsi="Microsoft YaHei" w:eastAsia="Microsoft YaHei"/>
-          <w:b w:val="0"/>
-          <w:i w:val="0"/>
-          <w:color w:val="1F2933"/>
-          <w:sz w:val="28"/>
-        </w:rPr>
-        <w:t>我已经预先做好了计划，所以实施起来很顺利。</w:t>
-      </w:r>
-      <w:r>
-        <w:rPr>
-          <w:rFonts w:ascii="Calibri" w:hAnsi="Calibri"/>
-          <w:b w:val="0"/>
-          <w:i/>
-          <w:color w:val="6B7683"/>
-          <w:sz w:val="20"/>
-        </w:rPr>
-        <w:t xml:space="preserve">  [slide]</w:t>
-      </w:r>
-    </w:p>
-    <w:p>
-      <w:r>
-        <w:rPr>
-          <w:rFonts w:ascii="Calibri" w:hAnsi="Calibri"/>
-          <w:b/>
-          <w:i w:val="0"/>
-          <w:color w:val="C0392B"/>
-          <w:sz w:val="24"/>
-        </w:rPr>
-        <w:t xml:space="preserve">2) </w:t>
-      </w:r>
-      <w:r>
-        <w:rPr>
-          <w:rFonts w:ascii="Calibri" w:hAnsi="Calibri"/>
-          <w:b/>
-          <w:i w:val="0"/>
-          <w:color w:val="6B7683"/>
-          <w:sz w:val="22"/>
-        </w:rPr>
-        <w:t xml:space="preserve">Chuẩn (đủ điểm): </w:t>
-      </w:r>
-      <w:r>
-        <w:rPr>
-          <w:rFonts w:ascii="Microsoft YaHei" w:hAnsi="Microsoft YaHei" w:eastAsia="Microsoft YaHei"/>
-          <w:b w:val="0"/>
-          <w:i w:val="0"/>
-          <w:color w:val="1F2933"/>
-          <w:sz w:val="28"/>
-        </w:rPr>
-        <w:t>富贵也好，贫穷也罢，我对他的爱不会改变。</w:t>
-      </w:r>
-      <w:r>
-        <w:rPr>
-          <w:rFonts w:ascii="Calibri" w:hAnsi="Calibri"/>
-          <w:b w:val="0"/>
-          <w:i/>
-          <w:color w:val="6B7683"/>
-          <w:sz w:val="20"/>
-        </w:rPr>
-        <w:t xml:space="preserve">  [slide]</w:t>
-      </w:r>
-    </w:p>
-    <w:p>
-      <w:r>
-        <w:rPr>
-          <w:rFonts w:ascii="Calibri" w:hAnsi="Calibri"/>
-          <w:b/>
-          <w:i w:val="0"/>
-          <w:color w:val="C0392B"/>
-          <w:sz w:val="24"/>
-        </w:rPr>
-        <w:t xml:space="preserve">3) </w:t>
-      </w:r>
-      <w:r>
-        <w:rPr>
-          <w:rFonts w:ascii="Calibri" w:hAnsi="Calibri"/>
-          <w:b/>
-          <w:i w:val="0"/>
-          <w:color w:val="6B7683"/>
-          <w:sz w:val="22"/>
-        </w:rPr>
-        <w:t xml:space="preserve">Chuẩn (đủ điểm): </w:t>
-      </w:r>
-      <w:r>
-        <w:rPr>
-          <w:rFonts w:ascii="Microsoft YaHei" w:hAnsi="Microsoft YaHei" w:eastAsia="Microsoft YaHei"/>
-          <w:b w:val="0"/>
-          <w:i w:val="0"/>
-          <w:color w:val="1F2933"/>
-          <w:sz w:val="28"/>
-        </w:rPr>
-        <w:t>付出艰苦努力的人什么都没得到，真是岂有此理。</w:t>
-      </w:r>
-      <w:r>
-        <w:rPr>
-          <w:rFonts w:ascii="Calibri" w:hAnsi="Calibri"/>
-          <w:b w:val="0"/>
-          <w:i/>
-          <w:color w:val="6B7683"/>
-          <w:sz w:val="20"/>
-        </w:rPr>
-        <w:t xml:space="preserve">  [slide]</w:t>
-      </w:r>
-    </w:p>
-    <w:p>
-      <w:r>
-        <w:rPr>
-          <w:rFonts w:ascii="Calibri" w:hAnsi="Calibri"/>
-          <w:b/>
-          <w:i w:val="0"/>
-          <w:color w:val="C0392B"/>
-          <w:sz w:val="24"/>
-        </w:rPr>
-        <w:t xml:space="preserve">4) </w:t>
-      </w:r>
-      <w:r>
-        <w:rPr>
-          <w:rFonts w:ascii="Calibri" w:hAnsi="Calibri"/>
-          <w:b/>
-          <w:i w:val="0"/>
-          <w:color w:val="6B7683"/>
-          <w:sz w:val="22"/>
-        </w:rPr>
-        <w:t xml:space="preserve">Chuẩn (đủ điểm): </w:t>
-      </w:r>
-      <w:r>
-        <w:rPr>
-          <w:rFonts w:ascii="Microsoft YaHei" w:hAnsi="Microsoft YaHei" w:eastAsia="Microsoft YaHei"/>
-          <w:b w:val="0"/>
-          <w:i w:val="0"/>
-          <w:color w:val="1F2933"/>
-          <w:sz w:val="28"/>
-        </w:rPr>
-        <w:t>“米”是国际上通用的基本长度单位。</w:t>
-      </w:r>
-      <w:r>
-        <w:rPr>
-          <w:rFonts w:ascii="Calibri" w:hAnsi="Calibri"/>
-          <w:b w:val="0"/>
-          <w:i/>
-          <w:color w:val="6B7683"/>
-          <w:sz w:val="20"/>
-        </w:rPr>
-        <w:t xml:space="preserve">  [slide]</w:t>
-      </w:r>
-    </w:p>
-    <w:p>
-      <w:r>
-        <w:rPr>
-          <w:rFonts w:ascii="Calibri" w:hAnsi="Calibri"/>
-          <w:b/>
-          <w:i w:val="0"/>
-          <w:color w:val="C0392B"/>
-          <w:sz w:val="24"/>
-        </w:rPr>
-        <w:t xml:space="preserve">5) </w:t>
-      </w:r>
-      <w:r>
-        <w:rPr>
-          <w:rFonts w:ascii="Calibri" w:hAnsi="Calibri"/>
-          <w:b/>
-          <w:i w:val="0"/>
-          <w:color w:val="6B7683"/>
-          <w:sz w:val="22"/>
-        </w:rPr>
-        <w:t xml:space="preserve">Chuẩn (đủ điểm): </w:t>
-      </w:r>
-      <w:r>
-        <w:rPr>
-          <w:rFonts w:ascii="Microsoft YaHei" w:hAnsi="Microsoft YaHei" w:eastAsia="Microsoft YaHei"/>
-          <w:b w:val="0"/>
-          <w:i w:val="0"/>
-          <w:color w:val="1F2933"/>
-          <w:sz w:val="28"/>
-        </w:rPr>
-        <w:t>问题的实质在于某些人缺乏责任心。</w:t>
-      </w:r>
-      <w:r>
-        <w:rPr>
-          <w:rFonts w:ascii="Calibri" w:hAnsi="Calibri"/>
-          <w:b w:val="0"/>
-          <w:i/>
-          <w:color w:val="6B7683"/>
-          <w:sz w:val="20"/>
-        </w:rPr>
-        <w:t xml:space="preserve">  [slide]</w:t>
-      </w:r>
-    </w:p>
-    <w:p>
-      <w:r>
-        <w:rPr>
-          <w:rFonts w:ascii="Calibri" w:hAnsi="Calibri"/>
-          <w:b/>
-          <w:i w:val="0"/>
-          <w:color w:val="C0392B"/>
-          <w:sz w:val="24"/>
-        </w:rPr>
-        <w:t xml:space="preserve">6) </w:t>
-      </w:r>
-      <w:r>
-        <w:rPr>
-          <w:rFonts w:ascii="Calibri" w:hAnsi="Calibri"/>
-          <w:b/>
-          <w:i w:val="0"/>
-          <w:color w:val="6B7683"/>
-          <w:sz w:val="22"/>
-        </w:rPr>
-        <w:t xml:space="preserve">Chuẩn (đủ điểm): </w:t>
-      </w:r>
-      <w:r>
-        <w:rPr>
-          <w:rFonts w:ascii="Microsoft YaHei" w:hAnsi="Microsoft YaHei" w:eastAsia="Microsoft YaHei"/>
-          <w:b w:val="0"/>
-          <w:i w:val="0"/>
-          <w:color w:val="1F2933"/>
-          <w:sz w:val="28"/>
-        </w:rPr>
-        <w:t>明天的会议很重要，发言稿你好好儿斟酌斟酌。</w:t>
-      </w:r>
-      <w:r>
-        <w:rPr>
-          <w:rFonts w:ascii="Calibri" w:hAnsi="Calibri"/>
-          <w:b w:val="0"/>
-          <w:i/>
-          <w:color w:val="6B7683"/>
-          <w:sz w:val="20"/>
-        </w:rPr>
-        <w:t xml:space="preserve">  [slide]</w:t>
-      </w:r>
-    </w:p>
-    <w:p>
-      <w:pPr>
-        <w:spacing w:before="280"/>
-      </w:pPr>
-      <w:r>
-        <w:rPr>
-          <w:rFonts w:ascii="Calibri" w:hAnsi="Calibri"/>
-          <w:b/>
-          <w:i w:val="0"/>
-          <w:color w:val="C0392B"/>
-          <w:sz w:val="30"/>
-        </w:rPr>
-        <w:t xml:space="preserve">7. </w:t>
-      </w:r>
-      <w:r>
-        <w:rPr>
-          <w:rFonts w:ascii="Microsoft YaHei" w:hAnsi="Microsoft YaHei" w:eastAsia="Microsoft YaHei"/>
-          <w:b/>
-          <w:i w:val="0"/>
-          <w:color w:val="1F2933"/>
-          <w:sz w:val="30"/>
-        </w:rPr>
-        <w:t>判断对错 — 各 / 诸</w:t>
-      </w:r>
-    </w:p>
-    <w:p>
-      <w:r>
-        <w:rPr>
-          <w:rFonts w:ascii="Calibri" w:hAnsi="Calibri"/>
-          <w:b/>
-          <w:i w:val="0"/>
-          <w:color w:val="C0392B"/>
-          <w:sz w:val="24"/>
-        </w:rPr>
-        <w:t xml:space="preserve">1) </w:t>
-      </w:r>
-      <w:r>
-        <w:rPr>
-          <w:rFonts w:ascii="Calibri" w:hAnsi="Calibri"/>
-          <w:b/>
-          <w:i w:val="0"/>
-          <w:color w:val="6B7683"/>
-          <w:sz w:val="22"/>
-        </w:rPr>
-        <w:t xml:space="preserve">Chuẩn (đủ điểm): </w:t>
-      </w:r>
-      <w:r>
-        <w:rPr>
-          <w:rFonts w:ascii="Microsoft YaHei" w:hAnsi="Microsoft YaHei" w:eastAsia="Microsoft YaHei"/>
-          <w:b w:val="0"/>
-          <w:i w:val="0"/>
-          <w:color w:val="1F2933"/>
-          <w:sz w:val="28"/>
-        </w:rPr>
-        <w:t>对。“各国” = mỗi nước, dùng đúng.</w:t>
-      </w:r>
-      <w:r>
-        <w:rPr>
-          <w:rFonts w:ascii="Calibri" w:hAnsi="Calibri"/>
-          <w:b w:val="0"/>
-          <w:i/>
-          <w:color w:val="6B7683"/>
-          <w:sz w:val="20"/>
-        </w:rPr>
-        <w:t xml:space="preserve">  [AI]</w:t>
-      </w:r>
-    </w:p>
-    <w:p>
-      <w:r>
-        <w:rPr>
-          <w:rFonts w:ascii="Calibri" w:hAnsi="Calibri"/>
-          <w:b/>
-          <w:i w:val="0"/>
-          <w:color w:val="C0392B"/>
-          <w:sz w:val="24"/>
-        </w:rPr>
-        <w:t xml:space="preserve">2) </w:t>
-      </w:r>
-      <w:r>
-        <w:rPr>
-          <w:rFonts w:ascii="Calibri" w:hAnsi="Calibri"/>
-          <w:b/>
-          <w:i w:val="0"/>
-          <w:color w:val="6B7683"/>
-          <w:sz w:val="22"/>
-        </w:rPr>
-        <w:t xml:space="preserve">Chuẩn (đủ điểm): </w:t>
-      </w:r>
-      <w:r>
-        <w:rPr>
-          <w:rFonts w:ascii="Microsoft YaHei" w:hAnsi="Microsoft YaHei" w:eastAsia="Microsoft YaHei"/>
-          <w:b w:val="0"/>
-          <w:i w:val="0"/>
-          <w:color w:val="1F2933"/>
-          <w:sz w:val="28"/>
-        </w:rPr>
-        <w:t>错。Nên dùng “各方”：经过各方的共同努力……（“诸” thường đi với danh từ chỉ người/kết cấu cố định).</w:t>
-      </w:r>
-      <w:r>
-        <w:rPr>
-          <w:rFonts w:ascii="Calibri" w:hAnsi="Calibri"/>
-          <w:b w:val="0"/>
-          <w:i/>
-          <w:color w:val="6B7683"/>
-          <w:sz w:val="20"/>
-        </w:rPr>
-        <w:t xml:space="preserve">  [AI]</w:t>
-      </w:r>
-    </w:p>
-    <w:p>
-      <w:r>
-        <w:rPr>
-          <w:rFonts w:ascii="Calibri" w:hAnsi="Calibri"/>
-          <w:b/>
-          <w:i w:val="0"/>
-          <w:color w:val="C0392B"/>
-          <w:sz w:val="24"/>
-        </w:rPr>
-        <w:t xml:space="preserve">3) </w:t>
-      </w:r>
-      <w:r>
-        <w:rPr>
-          <w:rFonts w:ascii="Calibri" w:hAnsi="Calibri"/>
-          <w:b/>
-          <w:i w:val="0"/>
-          <w:color w:val="6B7683"/>
-          <w:sz w:val="22"/>
-        </w:rPr>
-        <w:t xml:space="preserve">Chuẩn (đủ điểm): </w:t>
-      </w:r>
-      <w:r>
-        <w:rPr>
-          <w:rFonts w:ascii="Microsoft YaHei" w:hAnsi="Microsoft YaHei" w:eastAsia="Microsoft YaHei"/>
-          <w:b w:val="0"/>
-          <w:i w:val="0"/>
-          <w:color w:val="1F2933"/>
-          <w:sz w:val="28"/>
-        </w:rPr>
-        <w:t>对。“各有” = mỗi cái đều có, dùng đúng.</w:t>
-      </w:r>
-      <w:r>
-        <w:rPr>
-          <w:rFonts w:ascii="Calibri" w:hAnsi="Calibri"/>
-          <w:b w:val="0"/>
-          <w:i/>
-          <w:color w:val="6B7683"/>
-          <w:sz w:val="20"/>
-        </w:rPr>
-        <w:t xml:space="preserve">  [AI]</w:t>
-      </w:r>
-    </w:p>
-    <w:p>
-      <w:r>
-        <w:rPr>
-          <w:rFonts w:ascii="Calibri" w:hAnsi="Calibri"/>
-          <w:b/>
-          <w:i w:val="0"/>
-          <w:color w:val="C0392B"/>
-          <w:sz w:val="24"/>
-        </w:rPr>
-        <w:t xml:space="preserve">4) </w:t>
-      </w:r>
-      <w:r>
-        <w:rPr>
-          <w:rFonts w:ascii="Calibri" w:hAnsi="Calibri"/>
-          <w:b/>
-          <w:i w:val="0"/>
-          <w:color w:val="6B7683"/>
-          <w:sz w:val="22"/>
-        </w:rPr>
-        <w:t xml:space="preserve">Chuẩn (đủ điểm): </w:t>
-      </w:r>
-      <w:r>
-        <w:rPr>
-          <w:rFonts w:ascii="Microsoft YaHei" w:hAnsi="Microsoft YaHei" w:eastAsia="Microsoft YaHei"/>
-          <w:b w:val="0"/>
-          <w:i w:val="0"/>
-          <w:color w:val="1F2933"/>
-          <w:sz w:val="28"/>
-        </w:rPr>
-        <w:t>对。“诸子百家” là kết cấu cố định.</w:t>
-      </w:r>
-      <w:r>
-        <w:rPr>
-          <w:rFonts w:ascii="Calibri" w:hAnsi="Calibri"/>
-          <w:b w:val="0"/>
-          <w:i/>
-          <w:color w:val="6B7683"/>
-          <w:sz w:val="20"/>
-        </w:rPr>
-        <w:t xml:space="preserve">  [AI]</w:t>
-      </w:r>
-    </w:p>
-    <w:p>
-      <w:pPr>
-        <w:spacing w:before="280"/>
-      </w:pPr>
-      <w:r>
-        <w:rPr>
-          <w:rFonts w:ascii="Calibri" w:hAnsi="Calibri"/>
-          <w:b/>
-          <w:i w:val="0"/>
-          <w:color w:val="C0392B"/>
-          <w:sz w:val="30"/>
-        </w:rPr>
-        <w:t xml:space="preserve">8. </w:t>
-      </w:r>
-      <w:r>
-        <w:rPr>
-          <w:rFonts w:ascii="Microsoft YaHei" w:hAnsi="Microsoft YaHei" w:eastAsia="Microsoft YaHei"/>
-          <w:b/>
-          <w:i w:val="0"/>
-          <w:color w:val="1F2933"/>
-          <w:sz w:val="30"/>
-        </w:rPr>
-        <w:t>课文 1 —《大脑能“听”出笑声的真假》</w:t>
-      </w:r>
-    </w:p>
-    <w:p>
-      <w:r>
-        <w:rPr>
-          <w:rFonts w:ascii="Calibri" w:hAnsi="Calibri"/>
-          <w:b/>
-          <w:i w:val="0"/>
-          <w:color w:val="C0392B"/>
-          <w:sz w:val="24"/>
-        </w:rPr>
-        <w:t xml:space="preserve">1) </w:t>
-      </w:r>
-      <w:r>
-        <w:rPr>
-          <w:rFonts w:ascii="Microsoft YaHei" w:hAnsi="Microsoft YaHei" w:eastAsia="Microsoft YaHei"/>
-          <w:b w:val="0"/>
-          <w:i w:val="0"/>
-          <w:color w:val="1F2933"/>
-          <w:sz w:val="26"/>
-        </w:rPr>
-        <w:t>别人能看出你的笑是真是假，主要靠什么？</w:t>
-      </w:r>
-    </w:p>
-    <w:p>
-      <w:pPr>
-        <w:ind w:left="360"/>
-      </w:pPr>
-      <w:r>
-        <w:rPr>
-          <w:rFonts w:ascii="Calibri" w:hAnsi="Calibri"/>
-          <w:b w:val="0"/>
-          <w:i w:val="0"/>
-          <w:color w:val="1F2933"/>
-          <w:sz w:val="24"/>
-        </w:rPr>
-        <w:t xml:space="preserve">A. </w:t>
-      </w:r>
-      <w:r>
-        <w:rPr>
-          <w:rFonts w:ascii="Microsoft YaHei" w:hAnsi="Microsoft YaHei" w:eastAsia="Microsoft YaHei"/>
-          <w:b w:val="0"/>
-          <w:i w:val="0"/>
-          <w:color w:val="1F2933"/>
-          <w:sz w:val="24"/>
-        </w:rPr>
-        <w:t>靠你的表情和动作</w:t>
-      </w:r>
-    </w:p>
-    <w:p>
-      <w:pPr>
-        <w:ind w:left="360"/>
-      </w:pPr>
-      <w:r>
-        <w:rPr>
-          <w:rFonts w:ascii="Calibri" w:hAnsi="Calibri"/>
-          <w:b/>
-          <w:i w:val="0"/>
-          <w:color w:val="C0392B"/>
-          <w:sz w:val="24"/>
-        </w:rPr>
-        <w:t xml:space="preserve">✔ B. </w:t>
-      </w:r>
-      <w:r>
-        <w:rPr>
-          <w:rFonts w:ascii="Microsoft YaHei" w:hAnsi="Microsoft YaHei" w:eastAsia="Microsoft YaHei"/>
-          <w:b/>
-          <w:i w:val="0"/>
-          <w:color w:val="1F2933"/>
-          <w:sz w:val="24"/>
-        </w:rPr>
-        <w:t>靠大脑对真假笑声呈现出的不同反应</w:t>
-      </w:r>
-    </w:p>
-    <w:p>
-      <w:pPr>
-        <w:ind w:left="360"/>
-      </w:pPr>
-      <w:r>
-        <w:rPr>
-          <w:rFonts w:ascii="Calibri" w:hAnsi="Calibri"/>
-          <w:b w:val="0"/>
-          <w:i w:val="0"/>
-          <w:color w:val="1F2933"/>
-          <w:sz w:val="24"/>
-        </w:rPr>
-        <w:t xml:space="preserve">C. </w:t>
-      </w:r>
-      <w:r>
-        <w:rPr>
-          <w:rFonts w:ascii="Microsoft YaHei" w:hAnsi="Microsoft YaHei" w:eastAsia="Microsoft YaHei"/>
-          <w:b w:val="0"/>
-          <w:i w:val="0"/>
-          <w:color w:val="1F2933"/>
-          <w:sz w:val="24"/>
-        </w:rPr>
-        <w:t>靠你说话的内容</w:t>
-      </w:r>
-    </w:p>
-    <w:p>
-      <w:r>
-        <w:rPr>
-          <w:rFonts w:ascii="Calibri" w:hAnsi="Calibri"/>
-          <w:b w:val="0"/>
-          <w:i/>
-          <w:color w:val="6B7683"/>
-          <w:sz w:val="20"/>
-        </w:rPr>
-        <w:t>[AI]</w:t>
-      </w:r>
-    </w:p>
-    <w:p>
-      <w:r>
-        <w:rPr>
-          <w:rFonts w:ascii="Calibri" w:hAnsi="Calibri"/>
-          <w:b/>
-          <w:i w:val="0"/>
-          <w:color w:val="C0392B"/>
-          <w:sz w:val="24"/>
-        </w:rPr>
-        <w:t xml:space="preserve">2) </w:t>
-      </w:r>
-      <w:r>
-        <w:rPr>
-          <w:rFonts w:ascii="Microsoft YaHei" w:hAnsi="Microsoft YaHei" w:eastAsia="Microsoft YaHei"/>
-          <w:b w:val="0"/>
-          <w:i w:val="0"/>
-          <w:color w:val="1F2933"/>
-          <w:sz w:val="26"/>
-        </w:rPr>
-        <w:t>根据短文，如果不想让别人发现你在假笑，下面哪种做法作者“不建议”？</w:t>
-      </w:r>
-    </w:p>
-    <w:p>
-      <w:pPr>
-        <w:ind w:left="360"/>
-      </w:pPr>
-      <w:r>
-        <w:rPr>
-          <w:rFonts w:ascii="Calibri" w:hAnsi="Calibri"/>
-          <w:b w:val="0"/>
-          <w:i w:val="0"/>
-          <w:color w:val="1F2933"/>
-          <w:sz w:val="24"/>
-        </w:rPr>
-        <w:t xml:space="preserve">A. </w:t>
-      </w:r>
-      <w:r>
-        <w:rPr>
-          <w:rFonts w:ascii="Microsoft YaHei" w:hAnsi="Microsoft YaHei" w:eastAsia="Microsoft YaHei"/>
-          <w:b w:val="0"/>
-          <w:i w:val="0"/>
-          <w:color w:val="1F2933"/>
-          <w:sz w:val="24"/>
-        </w:rPr>
-        <w:t>把话题岔开、不表态</w:t>
-      </w:r>
-    </w:p>
-    <w:p>
-      <w:pPr>
-        <w:ind w:left="360"/>
-      </w:pPr>
-      <w:r>
-        <w:rPr>
-          <w:rFonts w:ascii="Calibri" w:hAnsi="Calibri"/>
-          <w:b w:val="0"/>
-          <w:i w:val="0"/>
-          <w:color w:val="1F2933"/>
-          <w:sz w:val="24"/>
-        </w:rPr>
-        <w:t xml:space="preserve">B. </w:t>
-      </w:r>
-      <w:r>
-        <w:rPr>
-          <w:rFonts w:ascii="Microsoft YaHei" w:hAnsi="Microsoft YaHei" w:eastAsia="Microsoft YaHei"/>
-          <w:b w:val="0"/>
-          <w:i w:val="0"/>
-          <w:color w:val="1F2933"/>
-          <w:sz w:val="24"/>
-        </w:rPr>
-        <w:t>回避、装聋装哑</w:t>
-      </w:r>
-    </w:p>
-    <w:p>
-      <w:pPr>
-        <w:ind w:left="360"/>
-      </w:pPr>
-      <w:r>
-        <w:rPr>
-          <w:rFonts w:ascii="Calibri" w:hAnsi="Calibri"/>
-          <w:b/>
-          <w:i w:val="0"/>
-          <w:color w:val="C0392B"/>
-          <w:sz w:val="24"/>
-        </w:rPr>
-        <w:t xml:space="preserve">✔ C. </w:t>
-      </w:r>
-      <w:r>
-        <w:rPr>
-          <w:rFonts w:ascii="Microsoft YaHei" w:hAnsi="Microsoft YaHei" w:eastAsia="Microsoft YaHei"/>
-          <w:b/>
-          <w:i w:val="0"/>
-          <w:color w:val="1F2933"/>
-          <w:sz w:val="24"/>
-        </w:rPr>
-        <w:t>画蛇添足，违心地笑</w:t>
-      </w:r>
-    </w:p>
-    <w:p>
-      <w:r>
-        <w:rPr>
-          <w:rFonts w:ascii="Calibri" w:hAnsi="Calibri"/>
-          <w:b w:val="0"/>
-          <w:i/>
-          <w:color w:val="6B7683"/>
-          <w:sz w:val="20"/>
-        </w:rPr>
-        <w:t>[AI]</w:t>
-      </w:r>
-    </w:p>
-    <w:p>
-      <w:pPr>
-        <w:spacing w:before="280"/>
-      </w:pPr>
-      <w:r>
-        <w:rPr>
-          <w:rFonts w:ascii="Calibri" w:hAnsi="Calibri"/>
-          <w:b/>
-          <w:i w:val="0"/>
-          <w:color w:val="C0392B"/>
-          <w:sz w:val="30"/>
-        </w:rPr>
-        <w:t xml:space="preserve">9. </w:t>
-      </w:r>
-      <w:r>
-        <w:rPr>
-          <w:rFonts w:ascii="Microsoft YaHei" w:hAnsi="Microsoft YaHei" w:eastAsia="Microsoft YaHei"/>
-          <w:b/>
-          <w:i w:val="0"/>
-          <w:color w:val="1F2933"/>
-          <w:sz w:val="30"/>
-        </w:rPr>
-        <w:t>复习 — 近义词连线</w:t>
-      </w:r>
-    </w:p>
-    <w:p>
-      <w:r>
-        <w:rPr>
-          <w:rFonts w:ascii="Microsoft YaHei" w:hAnsi="Microsoft YaHei" w:eastAsia="Microsoft YaHei"/>
-          <w:b/>
-          <w:i w:val="0"/>
-          <w:color w:val="1F2933"/>
-          <w:sz w:val="28"/>
-        </w:rPr>
-        <w:t>腐朽</w:t>
-      </w:r>
-      <w:r>
-        <w:rPr>
-          <w:rFonts w:ascii="Calibri" w:hAnsi="Calibri"/>
-          <w:b/>
-          <w:i w:val="0"/>
-          <w:color w:val="C0392B"/>
-          <w:sz w:val="24"/>
-        </w:rPr>
-        <w:t xml:space="preserve">  → D. </w:t>
-      </w:r>
-      <w:r>
-        <w:rPr>
-          <w:rFonts w:ascii="Microsoft YaHei" w:hAnsi="Microsoft YaHei" w:eastAsia="Microsoft YaHei"/>
-          <w:b w:val="0"/>
-          <w:i w:val="0"/>
-          <w:color w:val="1F2933"/>
-          <w:sz w:val="24"/>
-        </w:rPr>
-        <w:t>腐败</w:t>
-      </w:r>
-    </w:p>
-    <w:p>
-      <w:r>
-        <w:rPr>
-          <w:rFonts w:ascii="Microsoft YaHei" w:hAnsi="Microsoft YaHei" w:eastAsia="Microsoft YaHei"/>
-          <w:b/>
-          <w:i w:val="0"/>
-          <w:color w:val="1F2933"/>
-          <w:sz w:val="28"/>
-        </w:rPr>
-        <w:t>焦点</w:t>
-      </w:r>
-      <w:r>
-        <w:rPr>
-          <w:rFonts w:ascii="Calibri" w:hAnsi="Calibri"/>
-          <w:b/>
-          <w:i w:val="0"/>
-          <w:color w:val="C0392B"/>
-          <w:sz w:val="24"/>
-        </w:rPr>
-        <w:t xml:space="preserve">  → A. </w:t>
-      </w:r>
-      <w:r>
-        <w:rPr>
-          <w:rFonts w:ascii="Microsoft YaHei" w:hAnsi="Microsoft YaHei" w:eastAsia="Microsoft YaHei"/>
-          <w:b w:val="0"/>
-          <w:i w:val="0"/>
-          <w:color w:val="1F2933"/>
-          <w:sz w:val="24"/>
-        </w:rPr>
-        <w:t>中心</w:t>
-      </w:r>
-    </w:p>
-    <w:p>
-      <w:r>
-        <w:rPr>
-          <w:rFonts w:ascii="Microsoft YaHei" w:hAnsi="Microsoft YaHei" w:eastAsia="Microsoft YaHei"/>
-          <w:b/>
-          <w:i w:val="0"/>
-          <w:color w:val="1F2933"/>
-          <w:sz w:val="28"/>
-        </w:rPr>
-        <w:t>埋葬</w:t>
-      </w:r>
-      <w:r>
-        <w:rPr>
-          <w:rFonts w:ascii="Calibri" w:hAnsi="Calibri"/>
-          <w:b/>
-          <w:i w:val="0"/>
-          <w:color w:val="C0392B"/>
-          <w:sz w:val="24"/>
-        </w:rPr>
-        <w:t xml:space="preserve">  → B. </w:t>
-      </w:r>
-      <w:r>
-        <w:rPr>
-          <w:rFonts w:ascii="Microsoft YaHei" w:hAnsi="Microsoft YaHei" w:eastAsia="Microsoft YaHei"/>
-          <w:b w:val="0"/>
-          <w:i w:val="0"/>
-          <w:color w:val="1F2933"/>
-          <w:sz w:val="24"/>
-        </w:rPr>
-        <w:t>安葬</w:t>
-      </w:r>
-    </w:p>
-    <w:p>
-      <w:r>
-        <w:rPr>
-          <w:rFonts w:ascii="Microsoft YaHei" w:hAnsi="Microsoft YaHei" w:eastAsia="Microsoft YaHei"/>
-          <w:b/>
-          <w:i w:val="0"/>
-          <w:color w:val="1F2933"/>
-          <w:sz w:val="28"/>
-        </w:rPr>
-        <w:t>践踏</w:t>
-      </w:r>
-      <w:r>
-        <w:rPr>
-          <w:rFonts w:ascii="Calibri" w:hAnsi="Calibri"/>
-          <w:b/>
-          <w:i w:val="0"/>
-          <w:color w:val="C0392B"/>
-          <w:sz w:val="24"/>
-        </w:rPr>
-        <w:t xml:space="preserve">  → C. </w:t>
-      </w:r>
-      <w:r>
-        <w:rPr>
-          <w:rFonts w:ascii="Microsoft YaHei" w:hAnsi="Microsoft YaHei" w:eastAsia="Microsoft YaHei"/>
-          <w:b w:val="0"/>
-          <w:i w:val="0"/>
-          <w:color w:val="1F2933"/>
-          <w:sz w:val="24"/>
-        </w:rPr>
-        <w:t>摧残</w:t>
-      </w:r>
-    </w:p>
-    <w:p>
-      <w:pPr>
-        <w:spacing w:before="280"/>
-      </w:pPr>
-      <w:r>
-        <w:rPr>
-          <w:rFonts w:ascii="Calibri" w:hAnsi="Calibri"/>
-          <w:b/>
-          <w:i w:val="0"/>
-          <w:color w:val="C0392B"/>
-          <w:sz w:val="30"/>
-        </w:rPr>
-        <w:t xml:space="preserve">10. </w:t>
-      </w:r>
-      <w:r>
-        <w:rPr>
-          <w:rFonts w:ascii="Microsoft YaHei" w:hAnsi="Microsoft YaHei" w:eastAsia="Microsoft YaHei"/>
-          <w:b/>
-          <w:i w:val="0"/>
-          <w:color w:val="1F2933"/>
-          <w:sz w:val="30"/>
-        </w:rPr>
-        <w:t>写一写 / HSKK</w:t>
-      </w:r>
-    </w:p>
-    <w:p>
-      <w:r>
-        <w:rPr>
-          <w:rFonts w:ascii="Calibri" w:hAnsi="Calibri"/>
-          <w:b/>
-          <w:i w:val="0"/>
-          <w:color w:val="C0392B"/>
-          <w:sz w:val="24"/>
-        </w:rPr>
-        <w:t xml:space="preserve">1) </w:t>
-      </w:r>
-      <w:r>
-        <w:rPr>
-          <w:rFonts w:ascii="Calibri" w:hAnsi="Calibri"/>
-          <w:b/>
-          <w:i w:val="0"/>
-          <w:color w:val="6B7683"/>
-          <w:sz w:val="22"/>
-        </w:rPr>
-        <w:t xml:space="preserve">[viết] </w:t>
-      </w:r>
-      <w:r>
-        <w:rPr>
-          <w:rFonts w:ascii="Microsoft YaHei" w:hAnsi="Microsoft YaHei" w:eastAsia="Microsoft YaHei"/>
-          <w:b w:val="0"/>
-          <w:i w:val="0"/>
-          <w:color w:val="1F2933"/>
-          <w:sz w:val="26"/>
-        </w:rPr>
-        <w:t>简述课文《大脑能“听”出笑声的真假》的主要内容（约150–200字）。</w:t>
-      </w:r>
-    </w:p>
-    <w:p>
-      <w:pPr>
-        <w:ind w:left="360"/>
-      </w:pPr>
-      <w:r>
-        <w:rPr>
-          <w:rFonts w:ascii="Calibri" w:hAnsi="Calibri"/>
-          <w:b w:val="0"/>
-          <w:i w:val="0"/>
-          <w:color w:val="6B7683"/>
-          <w:sz w:val="24"/>
-        </w:rPr>
-        <w:t xml:space="preserve">– </w:t>
-      </w:r>
-      <w:r>
-        <w:rPr>
-          <w:rFonts w:ascii="Microsoft YaHei" w:hAnsi="Microsoft YaHei" w:eastAsia="Microsoft YaHei"/>
-          <w:b w:val="0"/>
-          <w:i w:val="0"/>
-          <w:color w:val="1F2933"/>
-          <w:sz w:val="24"/>
-        </w:rPr>
-        <w:t>Mở: nêu vấn đề — não có phân biệt được cười thật/cười giả không?</w:t>
-      </w:r>
-    </w:p>
-    <w:p>
-      <w:pPr>
-        <w:ind w:left="360"/>
-      </w:pPr>
-      <w:r>
-        <w:rPr>
-          <w:rFonts w:ascii="Calibri" w:hAnsi="Calibri"/>
-          <w:b w:val="0"/>
-          <w:i w:val="0"/>
-          <w:color w:val="6B7683"/>
-          <w:sz w:val="24"/>
-        </w:rPr>
-        <w:t xml:space="preserve">– </w:t>
-      </w:r>
-      <w:r>
-        <w:rPr>
-          <w:rFonts w:ascii="Microsoft YaHei" w:hAnsi="Microsoft YaHei" w:eastAsia="Microsoft YaHei"/>
-          <w:b w:val="0"/>
-          <w:i w:val="0"/>
-          <w:color w:val="1F2933"/>
-          <w:sz w:val="24"/>
-        </w:rPr>
-        <w:t>Thân: nghiên cứu phát hiện cười thật và cười giả khiến não phản ứng khác nhau; nêu cách/途径 nhận biết</w:t>
-      </w:r>
-    </w:p>
-    <w:p>
-      <w:pPr>
-        <w:ind w:left="360"/>
-      </w:pPr>
-      <w:r>
-        <w:rPr>
-          <w:rFonts w:ascii="Calibri" w:hAnsi="Calibri"/>
-          <w:b w:val="0"/>
-          <w:i w:val="0"/>
-          <w:color w:val="6B7683"/>
-          <w:sz w:val="24"/>
-        </w:rPr>
-        <w:t xml:space="preserve">– </w:t>
-      </w:r>
-      <w:r>
-        <w:rPr>
-          <w:rFonts w:ascii="Microsoft YaHei" w:hAnsi="Microsoft YaHei" w:eastAsia="Microsoft YaHei"/>
-          <w:b w:val="0"/>
-          <w:i w:val="0"/>
-          <w:color w:val="1F2933"/>
-          <w:sz w:val="24"/>
-        </w:rPr>
-        <w:t>Kết: ý nghĩa của tiếng cười chân thật và “知音”</w:t>
-      </w:r>
-    </w:p>
-    <w:p>
-      <w:r>
-        <w:rPr>
-          <w:rFonts w:ascii="Calibri" w:hAnsi="Calibri"/>
-          <w:b/>
-          <w:i w:val="0"/>
-          <w:color w:val="C0392B"/>
-          <w:sz w:val="24"/>
-        </w:rPr>
-        <w:t xml:space="preserve">2) </w:t>
-      </w:r>
-      <w:r>
-        <w:rPr>
-          <w:rFonts w:ascii="Calibri" w:hAnsi="Calibri"/>
-          <w:b/>
-          <w:i w:val="0"/>
-          <w:color w:val="6B7683"/>
-          <w:sz w:val="22"/>
-        </w:rPr>
-        <w:t xml:space="preserve">[HSKK] </w:t>
-      </w:r>
-      <w:r>
-        <w:rPr>
-          <w:rFonts w:ascii="Microsoft YaHei" w:hAnsi="Microsoft YaHei" w:eastAsia="Microsoft YaHei"/>
-          <w:b w:val="0"/>
-          <w:i w:val="0"/>
-          <w:color w:val="1F2933"/>
-          <w:sz w:val="26"/>
-        </w:rPr>
-        <w:t>谈谈你的看法：“笑”真的是人生旅途中的最佳良药吗？</w:t>
-      </w:r>
-    </w:p>
-    <w:p>
-      <w:pPr>
-        <w:ind w:left="360"/>
-      </w:pPr>
-      <w:r>
-        <w:rPr>
-          <w:rFonts w:ascii="Calibri" w:hAnsi="Calibri"/>
-          <w:b w:val="0"/>
-          <w:i w:val="0"/>
-          <w:color w:val="6B7683"/>
-          <w:sz w:val="24"/>
-        </w:rPr>
-        <w:t xml:space="preserve">– </w:t>
-      </w:r>
-      <w:r>
-        <w:rPr>
-          <w:rFonts w:ascii="Microsoft YaHei" w:hAnsi="Microsoft YaHei" w:eastAsia="Microsoft YaHei"/>
-          <w:b w:val="0"/>
-          <w:i w:val="0"/>
-          <w:color w:val="1F2933"/>
-          <w:sz w:val="24"/>
-        </w:rPr>
-        <w:t>Nêu quan điểm: cười có/không phải liều thuốc tốt</w:t>
-      </w:r>
-    </w:p>
-    <w:p>
-      <w:pPr>
-        <w:ind w:left="360"/>
-      </w:pPr>
-      <w:r>
-        <w:rPr>
-          <w:rFonts w:ascii="Calibri" w:hAnsi="Calibri"/>
-          <w:b w:val="0"/>
-          <w:i w:val="0"/>
-          <w:color w:val="6B7683"/>
-          <w:sz w:val="24"/>
-        </w:rPr>
-        <w:t xml:space="preserve">– </w:t>
-      </w:r>
-      <w:r>
-        <w:rPr>
-          <w:rFonts w:ascii="Microsoft YaHei" w:hAnsi="Microsoft YaHei" w:eastAsia="Microsoft YaHei"/>
-          <w:b w:val="0"/>
-          <w:i w:val="0"/>
-          <w:color w:val="1F2933"/>
-          <w:sz w:val="24"/>
-        </w:rPr>
-        <w:t>Lý do + ví dụ: liên hệ câu “开怀大笑也好，哈哈傻笑也罢……都是良方”</w:t>
-      </w:r>
-    </w:p>
-    <w:p>
-      <w:pPr>
-        <w:ind w:left="360"/>
-      </w:pPr>
-      <w:r>
-        <w:rPr>
-          <w:rFonts w:ascii="Calibri" w:hAnsi="Calibri"/>
-          <w:b w:val="0"/>
-          <w:i w:val="0"/>
-          <w:color w:val="6B7683"/>
-          <w:sz w:val="24"/>
-        </w:rPr>
-        <w:t xml:space="preserve">– </w:t>
-      </w:r>
-      <w:r>
-        <w:rPr>
-          <w:rFonts w:ascii="Microsoft YaHei" w:hAnsi="Microsoft YaHei" w:eastAsia="Microsoft YaHei"/>
-          <w:b w:val="0"/>
-          <w:i w:val="0"/>
-          <w:color w:val="1F2933"/>
-          <w:sz w:val="24"/>
-        </w:rPr>
-        <w:t>Liên hệ bản thân, chốt lại ngắn gọn</w:t>
+        <w:t>。</w:t>
       </w:r>
     </w:p>
     <w:sectPr>

</xml_diff>